<commit_message>
updated part1.docx to make it shorter
</commit_message>
<xml_diff>
--- a/part1.docx
+++ b/part1.docx
@@ -131,2122 +131,1690 @@
         <w:t>Entity Sets</w:t>
       </w:r>
     </w:p>
+    <w:tbl>
+      <w:tblPr>
+        <w:tblStyle w:val="TableGrid"/>
+        <w:tblW w:w="9463" w:type="dxa"/>
+        <w:tblLook w:val="04A0" w:firstRow="1" w:lastRow="0" w:firstColumn="1" w:lastColumn="0" w:noHBand="0" w:noVBand="1"/>
+      </w:tblPr>
+      <w:tblGrid>
+        <w:gridCol w:w="1186"/>
+        <w:gridCol w:w="1421"/>
+        <w:gridCol w:w="1545"/>
+        <w:gridCol w:w="5311"/>
+      </w:tblGrid>
+      <w:tr>
+        <w:trPr>
+          <w:trHeight w:val="288"/>
+        </w:trPr>
+        <w:tc>
+          <w:tcPr>
+            <w:tcW w:w="865" w:type="dxa"/>
+            <w:hideMark/>
+          </w:tcPr>
+          <w:p>
+            <w:pPr>
+              <w:rPr>
+                <w:rFonts w:ascii="Aptos Narrow" w:eastAsia="Times New Roman" w:hAnsi="Aptos Narrow" w:cs="Times New Roman"/>
+                <w:color w:val="000000"/>
+                <w:kern w:val="0"/>
+                <w:sz w:val="22"/>
+                <w:szCs w:val="22"/>
+                <w14:ligatures w14:val="none"/>
+              </w:rPr>
+            </w:pPr>
+            <w:r>
+              <w:rPr>
+                <w:rFonts w:ascii="Aptos Narrow" w:eastAsia="Times New Roman" w:hAnsi="Aptos Narrow" w:cs="Times New Roman"/>
+                <w:color w:val="000000"/>
+                <w:kern w:val="0"/>
+                <w:sz w:val="22"/>
+                <w:szCs w:val="22"/>
+                <w14:ligatures w14:val="none"/>
+              </w:rPr>
+              <w:t>Entity</w:t>
+            </w:r>
+          </w:p>
+        </w:tc>
+        <w:tc>
+          <w:tcPr>
+            <w:tcW w:w="1009" w:type="dxa"/>
+            <w:hideMark/>
+          </w:tcPr>
+          <w:p>
+            <w:pPr>
+              <w:rPr>
+                <w:rFonts w:ascii="Aptos Narrow" w:eastAsia="Times New Roman" w:hAnsi="Aptos Narrow" w:cs="Times New Roman"/>
+                <w:color w:val="000000"/>
+                <w:kern w:val="0"/>
+                <w:sz w:val="22"/>
+                <w:szCs w:val="22"/>
+                <w14:ligatures w14:val="none"/>
+              </w:rPr>
+            </w:pPr>
+            <w:r>
+              <w:rPr>
+                <w:rFonts w:ascii="Aptos Narrow" w:eastAsia="Times New Roman" w:hAnsi="Aptos Narrow" w:cs="Times New Roman"/>
+                <w:color w:val="000000"/>
+                <w:kern w:val="0"/>
+                <w:sz w:val="22"/>
+                <w:szCs w:val="22"/>
+                <w14:ligatures w14:val="none"/>
+              </w:rPr>
+              <w:t>Primary Key</w:t>
+            </w:r>
+          </w:p>
+        </w:tc>
+        <w:tc>
+          <w:tcPr>
+            <w:tcW w:w="1627" w:type="dxa"/>
+            <w:hideMark/>
+          </w:tcPr>
+          <w:p>
+            <w:pPr>
+              <w:rPr>
+                <w:rFonts w:ascii="Aptos Narrow" w:eastAsia="Times New Roman" w:hAnsi="Aptos Narrow" w:cs="Times New Roman"/>
+                <w:color w:val="000000"/>
+                <w:kern w:val="0"/>
+                <w:sz w:val="22"/>
+                <w:szCs w:val="22"/>
+                <w14:ligatures w14:val="none"/>
+              </w:rPr>
+            </w:pPr>
+            <w:r>
+              <w:rPr>
+                <w:rFonts w:ascii="Aptos Narrow" w:eastAsia="Times New Roman" w:hAnsi="Aptos Narrow" w:cs="Times New Roman"/>
+                <w:color w:val="000000"/>
+                <w:kern w:val="0"/>
+                <w:sz w:val="22"/>
+                <w:szCs w:val="22"/>
+                <w14:ligatures w14:val="none"/>
+              </w:rPr>
+              <w:t>Foreign Keys</w:t>
+            </w:r>
+          </w:p>
+        </w:tc>
+        <w:tc>
+          <w:tcPr>
+            <w:tcW w:w="5962" w:type="dxa"/>
+            <w:hideMark/>
+          </w:tcPr>
+          <w:p>
+            <w:pPr>
+              <w:rPr>
+                <w:rFonts w:ascii="Aptos Narrow" w:eastAsia="Times New Roman" w:hAnsi="Aptos Narrow" w:cs="Times New Roman"/>
+                <w:color w:val="000000"/>
+                <w:kern w:val="0"/>
+                <w:sz w:val="22"/>
+                <w:szCs w:val="22"/>
+                <w14:ligatures w14:val="none"/>
+              </w:rPr>
+            </w:pPr>
+            <w:r>
+              <w:rPr>
+                <w:rFonts w:ascii="Aptos Narrow" w:eastAsia="Times New Roman" w:hAnsi="Aptos Narrow" w:cs="Times New Roman"/>
+                <w:color w:val="000000"/>
+                <w:kern w:val="0"/>
+                <w:sz w:val="22"/>
+                <w:szCs w:val="22"/>
+                <w14:ligatures w14:val="none"/>
+              </w:rPr>
+              <w:t>Attributes</w:t>
+            </w:r>
+          </w:p>
+        </w:tc>
+      </w:tr>
+      <w:tr>
+        <w:trPr>
+          <w:trHeight w:val="288"/>
+        </w:trPr>
+        <w:tc>
+          <w:tcPr>
+            <w:tcW w:w="865" w:type="dxa"/>
+            <w:hideMark/>
+          </w:tcPr>
+          <w:p>
+            <w:pPr>
+              <w:rPr>
+                <w:rFonts w:ascii="Aptos Narrow" w:eastAsia="Times New Roman" w:hAnsi="Aptos Narrow" w:cs="Times New Roman"/>
+                <w:color w:val="000000"/>
+                <w:kern w:val="0"/>
+                <w:sz w:val="22"/>
+                <w:szCs w:val="22"/>
+                <w14:ligatures w14:val="none"/>
+              </w:rPr>
+            </w:pPr>
+            <w:r>
+              <w:rPr>
+                <w:rFonts w:ascii="Aptos Narrow" w:eastAsia="Times New Roman" w:hAnsi="Aptos Narrow" w:cs="Times New Roman"/>
+                <w:color w:val="000000"/>
+                <w:kern w:val="0"/>
+                <w:sz w:val="22"/>
+                <w:szCs w:val="22"/>
+                <w14:ligatures w14:val="none"/>
+              </w:rPr>
+              <w:t>Farms</w:t>
+            </w:r>
+          </w:p>
+        </w:tc>
+        <w:tc>
+          <w:tcPr>
+            <w:tcW w:w="1009" w:type="dxa"/>
+            <w:hideMark/>
+          </w:tcPr>
+          <w:p>
+            <w:pPr>
+              <w:rPr>
+                <w:rFonts w:ascii="Aptos Narrow" w:eastAsia="Times New Roman" w:hAnsi="Aptos Narrow" w:cs="Times New Roman"/>
+                <w:color w:val="000000"/>
+                <w:kern w:val="0"/>
+                <w:sz w:val="22"/>
+                <w:szCs w:val="22"/>
+                <w14:ligatures w14:val="none"/>
+              </w:rPr>
+            </w:pPr>
+            <w:r>
+              <w:rPr>
+                <w:rFonts w:ascii="Aptos Narrow" w:eastAsia="Times New Roman" w:hAnsi="Aptos Narrow" w:cs="Times New Roman"/>
+                <w:color w:val="000000"/>
+                <w:kern w:val="0"/>
+                <w:sz w:val="22"/>
+                <w:szCs w:val="22"/>
+                <w14:ligatures w14:val="none"/>
+              </w:rPr>
+              <w:t>farm_id</w:t>
+            </w:r>
+          </w:p>
+        </w:tc>
+        <w:tc>
+          <w:tcPr>
+            <w:tcW w:w="1627" w:type="dxa"/>
+            <w:hideMark/>
+          </w:tcPr>
+          <w:p>
+            <w:pPr>
+              <w:rPr>
+                <w:rFonts w:ascii="Aptos Narrow" w:eastAsia="Times New Roman" w:hAnsi="Aptos Narrow" w:cs="Times New Roman"/>
+                <w:color w:val="000000"/>
+                <w:kern w:val="0"/>
+                <w:sz w:val="22"/>
+                <w:szCs w:val="22"/>
+                <w14:ligatures w14:val="none"/>
+              </w:rPr>
+            </w:pPr>
+          </w:p>
+        </w:tc>
+        <w:tc>
+          <w:tcPr>
+            <w:tcW w:w="5962" w:type="dxa"/>
+            <w:hideMark/>
+          </w:tcPr>
+          <w:p>
+            <w:pPr>
+              <w:rPr>
+                <w:rFonts w:ascii="Aptos Narrow" w:eastAsia="Times New Roman" w:hAnsi="Aptos Narrow" w:cs="Times New Roman"/>
+                <w:color w:val="000000"/>
+                <w:kern w:val="0"/>
+                <w:sz w:val="22"/>
+                <w:szCs w:val="22"/>
+                <w14:ligatures w14:val="none"/>
+              </w:rPr>
+            </w:pPr>
+            <w:r>
+              <w:rPr>
+                <w:rFonts w:ascii="Aptos Narrow" w:eastAsia="Times New Roman" w:hAnsi="Aptos Narrow" w:cs="Times New Roman"/>
+                <w:color w:val="000000"/>
+                <w:kern w:val="0"/>
+                <w:sz w:val="22"/>
+                <w:szCs w:val="22"/>
+                <w14:ligatures w14:val="none"/>
+              </w:rPr>
+              <w:t>farm_name, street_address, city, state, zip_code, total_acres, established_date, phone</w:t>
+            </w:r>
+          </w:p>
+        </w:tc>
+      </w:tr>
+      <w:tr>
+        <w:trPr>
+          <w:trHeight w:val="288"/>
+        </w:trPr>
+        <w:tc>
+          <w:tcPr>
+            <w:tcW w:w="865" w:type="dxa"/>
+            <w:hideMark/>
+          </w:tcPr>
+          <w:p>
+            <w:pPr>
+              <w:rPr>
+                <w:rFonts w:ascii="Aptos Narrow" w:eastAsia="Times New Roman" w:hAnsi="Aptos Narrow" w:cs="Times New Roman"/>
+                <w:color w:val="000000"/>
+                <w:kern w:val="0"/>
+                <w:sz w:val="22"/>
+                <w:szCs w:val="22"/>
+                <w14:ligatures w14:val="none"/>
+              </w:rPr>
+            </w:pPr>
+            <w:r>
+              <w:rPr>
+                <w:rFonts w:ascii="Aptos Narrow" w:eastAsia="Times New Roman" w:hAnsi="Aptos Narrow" w:cs="Times New Roman"/>
+                <w:color w:val="000000"/>
+                <w:kern w:val="0"/>
+                <w:sz w:val="22"/>
+                <w:szCs w:val="22"/>
+                <w14:ligatures w14:val="none"/>
+              </w:rPr>
+              <w:t>Equipment</w:t>
+            </w:r>
+          </w:p>
+        </w:tc>
+        <w:tc>
+          <w:tcPr>
+            <w:tcW w:w="1009" w:type="dxa"/>
+            <w:hideMark/>
+          </w:tcPr>
+          <w:p>
+            <w:pPr>
+              <w:rPr>
+                <w:rFonts w:ascii="Aptos Narrow" w:eastAsia="Times New Roman" w:hAnsi="Aptos Narrow" w:cs="Times New Roman"/>
+                <w:color w:val="000000"/>
+                <w:kern w:val="0"/>
+                <w:sz w:val="22"/>
+                <w:szCs w:val="22"/>
+                <w14:ligatures w14:val="none"/>
+              </w:rPr>
+            </w:pPr>
+            <w:r>
+              <w:rPr>
+                <w:rFonts w:ascii="Aptos Narrow" w:eastAsia="Times New Roman" w:hAnsi="Aptos Narrow" w:cs="Times New Roman"/>
+                <w:color w:val="000000"/>
+                <w:kern w:val="0"/>
+                <w:sz w:val="22"/>
+                <w:szCs w:val="22"/>
+                <w14:ligatures w14:val="none"/>
+              </w:rPr>
+              <w:t>equipment_id</w:t>
+            </w:r>
+          </w:p>
+        </w:tc>
+        <w:tc>
+          <w:tcPr>
+            <w:tcW w:w="1627" w:type="dxa"/>
+            <w:hideMark/>
+          </w:tcPr>
+          <w:p>
+            <w:pPr>
+              <w:rPr>
+                <w:rFonts w:ascii="Aptos Narrow" w:eastAsia="Times New Roman" w:hAnsi="Aptos Narrow" w:cs="Times New Roman"/>
+                <w:color w:val="000000"/>
+                <w:kern w:val="0"/>
+                <w:sz w:val="22"/>
+                <w:szCs w:val="22"/>
+                <w14:ligatures w14:val="none"/>
+              </w:rPr>
+            </w:pPr>
+            <w:r>
+              <w:rPr>
+                <w:rFonts w:ascii="Aptos Narrow" w:eastAsia="Times New Roman" w:hAnsi="Aptos Narrow" w:cs="Times New Roman"/>
+                <w:color w:val="000000"/>
+                <w:kern w:val="0"/>
+                <w:sz w:val="22"/>
+                <w:szCs w:val="22"/>
+                <w14:ligatures w14:val="none"/>
+              </w:rPr>
+              <w:t>farm_id (Farms), building_id (Buildings, nullable)</w:t>
+            </w:r>
+          </w:p>
+        </w:tc>
+        <w:tc>
+          <w:tcPr>
+            <w:tcW w:w="5962" w:type="dxa"/>
+            <w:hideMark/>
+          </w:tcPr>
+          <w:p>
+            <w:pPr>
+              <w:rPr>
+                <w:rFonts w:ascii="Aptos Narrow" w:eastAsia="Times New Roman" w:hAnsi="Aptos Narrow" w:cs="Times New Roman"/>
+                <w:color w:val="000000"/>
+                <w:kern w:val="0"/>
+                <w:sz w:val="22"/>
+                <w:szCs w:val="22"/>
+                <w14:ligatures w14:val="none"/>
+              </w:rPr>
+            </w:pPr>
+            <w:r>
+              <w:rPr>
+                <w:rFonts w:ascii="Aptos Narrow" w:eastAsia="Times New Roman" w:hAnsi="Aptos Narrow" w:cs="Times New Roman"/>
+                <w:color w:val="000000"/>
+                <w:kern w:val="0"/>
+                <w:sz w:val="22"/>
+                <w:szCs w:val="22"/>
+                <w14:ligatures w14:val="none"/>
+              </w:rPr>
+              <w:t>equipment_name, equipment_type (tractor/harvester/irrigation/trailer), manufacturer, model, serial_number, purchase_date, purchase_price, condition_status (operational/in repair/retired), last_service_date (nullable)</w:t>
+            </w:r>
+          </w:p>
+        </w:tc>
+      </w:tr>
+      <w:tr>
+        <w:trPr>
+          <w:trHeight w:val="288"/>
+        </w:trPr>
+        <w:tc>
+          <w:tcPr>
+            <w:tcW w:w="865" w:type="dxa"/>
+            <w:hideMark/>
+          </w:tcPr>
+          <w:p>
+            <w:pPr>
+              <w:rPr>
+                <w:rFonts w:ascii="Aptos Narrow" w:eastAsia="Times New Roman" w:hAnsi="Aptos Narrow" w:cs="Times New Roman"/>
+                <w:color w:val="000000"/>
+                <w:kern w:val="0"/>
+                <w:sz w:val="22"/>
+                <w:szCs w:val="22"/>
+                <w14:ligatures w14:val="none"/>
+              </w:rPr>
+            </w:pPr>
+            <w:r>
+              <w:rPr>
+                <w:rFonts w:ascii="Aptos Narrow" w:eastAsia="Times New Roman" w:hAnsi="Aptos Narrow" w:cs="Times New Roman"/>
+                <w:color w:val="000000"/>
+                <w:kern w:val="0"/>
+                <w:sz w:val="22"/>
+                <w:szCs w:val="22"/>
+                <w14:ligatures w14:val="none"/>
+              </w:rPr>
+              <w:t>Animals</w:t>
+            </w:r>
+          </w:p>
+        </w:tc>
+        <w:tc>
+          <w:tcPr>
+            <w:tcW w:w="1009" w:type="dxa"/>
+            <w:hideMark/>
+          </w:tcPr>
+          <w:p>
+            <w:pPr>
+              <w:rPr>
+                <w:rFonts w:ascii="Aptos Narrow" w:eastAsia="Times New Roman" w:hAnsi="Aptos Narrow" w:cs="Times New Roman"/>
+                <w:color w:val="000000"/>
+                <w:kern w:val="0"/>
+                <w:sz w:val="22"/>
+                <w:szCs w:val="22"/>
+                <w14:ligatures w14:val="none"/>
+              </w:rPr>
+            </w:pPr>
+            <w:r>
+              <w:rPr>
+                <w:rFonts w:ascii="Aptos Narrow" w:eastAsia="Times New Roman" w:hAnsi="Aptos Narrow" w:cs="Times New Roman"/>
+                <w:color w:val="000000"/>
+                <w:kern w:val="0"/>
+                <w:sz w:val="22"/>
+                <w:szCs w:val="22"/>
+                <w14:ligatures w14:val="none"/>
+              </w:rPr>
+              <w:t>animal_id</w:t>
+            </w:r>
+          </w:p>
+        </w:tc>
+        <w:tc>
+          <w:tcPr>
+            <w:tcW w:w="1627" w:type="dxa"/>
+            <w:hideMark/>
+          </w:tcPr>
+          <w:p>
+            <w:pPr>
+              <w:rPr>
+                <w:rFonts w:ascii="Aptos Narrow" w:eastAsia="Times New Roman" w:hAnsi="Aptos Narrow" w:cs="Times New Roman"/>
+                <w:color w:val="000000"/>
+                <w:kern w:val="0"/>
+                <w:sz w:val="22"/>
+                <w:szCs w:val="22"/>
+                <w14:ligatures w14:val="none"/>
+              </w:rPr>
+            </w:pPr>
+            <w:r>
+              <w:rPr>
+                <w:rFonts w:ascii="Aptos Narrow" w:eastAsia="Times New Roman" w:hAnsi="Aptos Narrow" w:cs="Times New Roman"/>
+                <w:color w:val="000000"/>
+                <w:kern w:val="0"/>
+                <w:sz w:val="22"/>
+                <w:szCs w:val="22"/>
+                <w14:ligatures w14:val="none"/>
+              </w:rPr>
+              <w:t>farm_id (Farms), building_id (Buildings, nullable)</w:t>
+            </w:r>
+          </w:p>
+        </w:tc>
+        <w:tc>
+          <w:tcPr>
+            <w:tcW w:w="5962" w:type="dxa"/>
+            <w:hideMark/>
+          </w:tcPr>
+          <w:p>
+            <w:pPr>
+              <w:rPr>
+                <w:rFonts w:ascii="Aptos Narrow" w:eastAsia="Times New Roman" w:hAnsi="Aptos Narrow" w:cs="Times New Roman"/>
+                <w:color w:val="000000"/>
+                <w:kern w:val="0"/>
+                <w:sz w:val="22"/>
+                <w:szCs w:val="22"/>
+                <w14:ligatures w14:val="none"/>
+              </w:rPr>
+            </w:pPr>
+            <w:r>
+              <w:rPr>
+                <w:rFonts w:ascii="Aptos Narrow" w:eastAsia="Times New Roman" w:hAnsi="Aptos Narrow" w:cs="Times New Roman"/>
+                <w:color w:val="000000"/>
+                <w:kern w:val="0"/>
+                <w:sz w:val="22"/>
+                <w:szCs w:val="22"/>
+                <w14:ligatures w14:val="none"/>
+              </w:rPr>
+              <w:t>species, breed, sex, birth_date, weight_lbs, health_status, acquisition_date, purpose (dairy/meat/breeding/eggs), move_in_date (nullable)</w:t>
+            </w:r>
+          </w:p>
+        </w:tc>
+      </w:tr>
+      <w:tr>
+        <w:trPr>
+          <w:trHeight w:val="288"/>
+        </w:trPr>
+        <w:tc>
+          <w:tcPr>
+            <w:tcW w:w="865" w:type="dxa"/>
+            <w:hideMark/>
+          </w:tcPr>
+          <w:p>
+            <w:pPr>
+              <w:rPr>
+                <w:rFonts w:ascii="Aptos Narrow" w:eastAsia="Times New Roman" w:hAnsi="Aptos Narrow" w:cs="Times New Roman"/>
+                <w:color w:val="000000"/>
+                <w:kern w:val="0"/>
+                <w:sz w:val="22"/>
+                <w:szCs w:val="22"/>
+                <w14:ligatures w14:val="none"/>
+              </w:rPr>
+            </w:pPr>
+            <w:r>
+              <w:rPr>
+                <w:rFonts w:ascii="Aptos Narrow" w:eastAsia="Times New Roman" w:hAnsi="Aptos Narrow" w:cs="Times New Roman"/>
+                <w:color w:val="000000"/>
+                <w:kern w:val="0"/>
+                <w:sz w:val="22"/>
+                <w:szCs w:val="22"/>
+                <w14:ligatures w14:val="none"/>
+              </w:rPr>
+              <w:t>Crops</w:t>
+            </w:r>
+          </w:p>
+        </w:tc>
+        <w:tc>
+          <w:tcPr>
+            <w:tcW w:w="1009" w:type="dxa"/>
+            <w:hideMark/>
+          </w:tcPr>
+          <w:p>
+            <w:pPr>
+              <w:rPr>
+                <w:rFonts w:ascii="Aptos Narrow" w:eastAsia="Times New Roman" w:hAnsi="Aptos Narrow" w:cs="Times New Roman"/>
+                <w:color w:val="000000"/>
+                <w:kern w:val="0"/>
+                <w:sz w:val="22"/>
+                <w:szCs w:val="22"/>
+                <w14:ligatures w14:val="none"/>
+              </w:rPr>
+            </w:pPr>
+            <w:r>
+              <w:rPr>
+                <w:rFonts w:ascii="Aptos Narrow" w:eastAsia="Times New Roman" w:hAnsi="Aptos Narrow" w:cs="Times New Roman"/>
+                <w:color w:val="000000"/>
+                <w:kern w:val="0"/>
+                <w:sz w:val="22"/>
+                <w:szCs w:val="22"/>
+                <w14:ligatures w14:val="none"/>
+              </w:rPr>
+              <w:t>crop_id</w:t>
+            </w:r>
+          </w:p>
+        </w:tc>
+        <w:tc>
+          <w:tcPr>
+            <w:tcW w:w="1627" w:type="dxa"/>
+            <w:hideMark/>
+          </w:tcPr>
+          <w:p>
+            <w:pPr>
+              <w:rPr>
+                <w:rFonts w:ascii="Aptos Narrow" w:eastAsia="Times New Roman" w:hAnsi="Aptos Narrow" w:cs="Times New Roman"/>
+                <w:color w:val="000000"/>
+                <w:kern w:val="0"/>
+                <w:sz w:val="22"/>
+                <w:szCs w:val="22"/>
+                <w14:ligatures w14:val="none"/>
+              </w:rPr>
+            </w:pPr>
+          </w:p>
+        </w:tc>
+        <w:tc>
+          <w:tcPr>
+            <w:tcW w:w="5962" w:type="dxa"/>
+            <w:hideMark/>
+          </w:tcPr>
+          <w:p>
+            <w:pPr>
+              <w:rPr>
+                <w:rFonts w:ascii="Aptos Narrow" w:eastAsia="Times New Roman" w:hAnsi="Aptos Narrow" w:cs="Times New Roman"/>
+                <w:color w:val="000000"/>
+                <w:kern w:val="0"/>
+                <w:sz w:val="22"/>
+                <w:szCs w:val="22"/>
+                <w14:ligatures w14:val="none"/>
+              </w:rPr>
+            </w:pPr>
+            <w:r>
+              <w:rPr>
+                <w:rFonts w:ascii="Aptos Narrow" w:eastAsia="Times New Roman" w:hAnsi="Aptos Narrow" w:cs="Times New Roman"/>
+                <w:color w:val="000000"/>
+                <w:kern w:val="0"/>
+                <w:sz w:val="22"/>
+                <w:szCs w:val="22"/>
+                <w14:ligatures w14:val="none"/>
+              </w:rPr>
+              <w:t>crop_name, variety, yield_unit (bushels/tons/lbs)</w:t>
+            </w:r>
+          </w:p>
+        </w:tc>
+      </w:tr>
+      <w:tr>
+        <w:trPr>
+          <w:trHeight w:val="288"/>
+        </w:trPr>
+        <w:tc>
+          <w:tcPr>
+            <w:tcW w:w="865" w:type="dxa"/>
+            <w:hideMark/>
+          </w:tcPr>
+          <w:p>
+            <w:pPr>
+              <w:rPr>
+                <w:rFonts w:ascii="Aptos Narrow" w:eastAsia="Times New Roman" w:hAnsi="Aptos Narrow" w:cs="Times New Roman"/>
+                <w:color w:val="000000"/>
+                <w:kern w:val="0"/>
+                <w:sz w:val="22"/>
+                <w:szCs w:val="22"/>
+                <w14:ligatures w14:val="none"/>
+              </w:rPr>
+            </w:pPr>
+            <w:r>
+              <w:rPr>
+                <w:rFonts w:ascii="Aptos Narrow" w:eastAsia="Times New Roman" w:hAnsi="Aptos Narrow" w:cs="Times New Roman"/>
+                <w:color w:val="000000"/>
+                <w:kern w:val="0"/>
+                <w:sz w:val="22"/>
+                <w:szCs w:val="22"/>
+                <w14:ligatures w14:val="none"/>
+              </w:rPr>
+              <w:t>Plantings</w:t>
+            </w:r>
+          </w:p>
+        </w:tc>
+        <w:tc>
+          <w:tcPr>
+            <w:tcW w:w="1009" w:type="dxa"/>
+            <w:hideMark/>
+          </w:tcPr>
+          <w:p>
+            <w:pPr>
+              <w:rPr>
+                <w:rFonts w:ascii="Aptos Narrow" w:eastAsia="Times New Roman" w:hAnsi="Aptos Narrow" w:cs="Times New Roman"/>
+                <w:color w:val="000000"/>
+                <w:kern w:val="0"/>
+                <w:sz w:val="22"/>
+                <w:szCs w:val="22"/>
+                <w14:ligatures w14:val="none"/>
+              </w:rPr>
+            </w:pPr>
+            <w:r>
+              <w:rPr>
+                <w:rFonts w:ascii="Aptos Narrow" w:eastAsia="Times New Roman" w:hAnsi="Aptos Narrow" w:cs="Times New Roman"/>
+                <w:color w:val="000000"/>
+                <w:kern w:val="0"/>
+                <w:sz w:val="22"/>
+                <w:szCs w:val="22"/>
+                <w14:ligatures w14:val="none"/>
+              </w:rPr>
+              <w:t>planting_id</w:t>
+            </w:r>
+          </w:p>
+        </w:tc>
+        <w:tc>
+          <w:tcPr>
+            <w:tcW w:w="1627" w:type="dxa"/>
+            <w:hideMark/>
+          </w:tcPr>
+          <w:p>
+            <w:pPr>
+              <w:rPr>
+                <w:rFonts w:ascii="Aptos Narrow" w:eastAsia="Times New Roman" w:hAnsi="Aptos Narrow" w:cs="Times New Roman"/>
+                <w:color w:val="000000"/>
+                <w:kern w:val="0"/>
+                <w:sz w:val="22"/>
+                <w:szCs w:val="22"/>
+                <w14:ligatures w14:val="none"/>
+              </w:rPr>
+            </w:pPr>
+            <w:r>
+              <w:rPr>
+                <w:rFonts w:ascii="Aptos Narrow" w:eastAsia="Times New Roman" w:hAnsi="Aptos Narrow" w:cs="Times New Roman"/>
+                <w:color w:val="000000"/>
+                <w:kern w:val="0"/>
+                <w:sz w:val="22"/>
+                <w:szCs w:val="22"/>
+                <w14:ligatures w14:val="none"/>
+              </w:rPr>
+              <w:t xml:space="preserve">farm_id (Farms), </w:t>
+            </w:r>
+            <w:r>
+              <w:rPr>
+                <w:rFonts w:ascii="Aptos Narrow" w:eastAsia="Times New Roman" w:hAnsi="Aptos Narrow" w:cs="Times New Roman"/>
+                <w:color w:val="000000"/>
+                <w:kern w:val="0"/>
+                <w:sz w:val="22"/>
+                <w:szCs w:val="22"/>
+                <w14:ligatures w14:val="none"/>
+              </w:rPr>
+              <w:lastRenderedPageBreak/>
+              <w:t>crop_id (Crops)</w:t>
+            </w:r>
+          </w:p>
+        </w:tc>
+        <w:tc>
+          <w:tcPr>
+            <w:tcW w:w="5962" w:type="dxa"/>
+            <w:hideMark/>
+          </w:tcPr>
+          <w:p>
+            <w:pPr>
+              <w:rPr>
+                <w:rFonts w:ascii="Aptos Narrow" w:eastAsia="Times New Roman" w:hAnsi="Aptos Narrow" w:cs="Times New Roman"/>
+                <w:color w:val="000000"/>
+                <w:kern w:val="0"/>
+                <w:sz w:val="22"/>
+                <w:szCs w:val="22"/>
+                <w14:ligatures w14:val="none"/>
+              </w:rPr>
+            </w:pPr>
+            <w:r>
+              <w:rPr>
+                <w:rFonts w:ascii="Aptos Narrow" w:eastAsia="Times New Roman" w:hAnsi="Aptos Narrow" w:cs="Times New Roman"/>
+                <w:color w:val="000000"/>
+                <w:kern w:val="0"/>
+                <w:sz w:val="22"/>
+                <w:szCs w:val="22"/>
+                <w14:ligatures w14:val="none"/>
+              </w:rPr>
+              <w:lastRenderedPageBreak/>
+              <w:t xml:space="preserve">field_number, acres_planted, planting_date, expected_harvest_date, actual_harvest_date (nullable), </w:t>
+            </w:r>
+            <w:r>
+              <w:rPr>
+                <w:rFonts w:ascii="Aptos Narrow" w:eastAsia="Times New Roman" w:hAnsi="Aptos Narrow" w:cs="Times New Roman"/>
+                <w:color w:val="000000"/>
+                <w:kern w:val="0"/>
+                <w:sz w:val="22"/>
+                <w:szCs w:val="22"/>
+                <w14:ligatures w14:val="none"/>
+              </w:rPr>
+              <w:lastRenderedPageBreak/>
+              <w:t>yield_amount (nullable), growth_status (planted/growing/harvested)</w:t>
+            </w:r>
+          </w:p>
+        </w:tc>
+      </w:tr>
+      <w:tr>
+        <w:trPr>
+          <w:trHeight w:val="288"/>
+        </w:trPr>
+        <w:tc>
+          <w:tcPr>
+            <w:tcW w:w="865" w:type="dxa"/>
+            <w:hideMark/>
+          </w:tcPr>
+          <w:p>
+            <w:pPr>
+              <w:rPr>
+                <w:rFonts w:ascii="Aptos Narrow" w:eastAsia="Times New Roman" w:hAnsi="Aptos Narrow" w:cs="Times New Roman"/>
+                <w:color w:val="000000"/>
+                <w:kern w:val="0"/>
+                <w:sz w:val="22"/>
+                <w:szCs w:val="22"/>
+                <w14:ligatures w14:val="none"/>
+              </w:rPr>
+            </w:pPr>
+            <w:r>
+              <w:rPr>
+                <w:rFonts w:ascii="Aptos Narrow" w:eastAsia="Times New Roman" w:hAnsi="Aptos Narrow" w:cs="Times New Roman"/>
+                <w:color w:val="000000"/>
+                <w:kern w:val="0"/>
+                <w:sz w:val="22"/>
+                <w:szCs w:val="22"/>
+                <w14:ligatures w14:val="none"/>
+              </w:rPr>
+              <w:lastRenderedPageBreak/>
+              <w:t>Workers</w:t>
+            </w:r>
+          </w:p>
+        </w:tc>
+        <w:tc>
+          <w:tcPr>
+            <w:tcW w:w="1009" w:type="dxa"/>
+            <w:hideMark/>
+          </w:tcPr>
+          <w:p>
+            <w:pPr>
+              <w:rPr>
+                <w:rFonts w:ascii="Aptos Narrow" w:eastAsia="Times New Roman" w:hAnsi="Aptos Narrow" w:cs="Times New Roman"/>
+                <w:color w:val="000000"/>
+                <w:kern w:val="0"/>
+                <w:sz w:val="22"/>
+                <w:szCs w:val="22"/>
+                <w14:ligatures w14:val="none"/>
+              </w:rPr>
+            </w:pPr>
+            <w:r>
+              <w:rPr>
+                <w:rFonts w:ascii="Aptos Narrow" w:eastAsia="Times New Roman" w:hAnsi="Aptos Narrow" w:cs="Times New Roman"/>
+                <w:color w:val="000000"/>
+                <w:kern w:val="0"/>
+                <w:sz w:val="22"/>
+                <w:szCs w:val="22"/>
+                <w14:ligatures w14:val="none"/>
+              </w:rPr>
+              <w:t>worker_id</w:t>
+            </w:r>
+          </w:p>
+        </w:tc>
+        <w:tc>
+          <w:tcPr>
+            <w:tcW w:w="1627" w:type="dxa"/>
+            <w:hideMark/>
+          </w:tcPr>
+          <w:p>
+            <w:pPr>
+              <w:rPr>
+                <w:rFonts w:ascii="Aptos Narrow" w:eastAsia="Times New Roman" w:hAnsi="Aptos Narrow" w:cs="Times New Roman"/>
+                <w:color w:val="000000"/>
+                <w:kern w:val="0"/>
+                <w:sz w:val="22"/>
+                <w:szCs w:val="22"/>
+                <w14:ligatures w14:val="none"/>
+              </w:rPr>
+            </w:pPr>
+            <w:r>
+              <w:rPr>
+                <w:rFonts w:ascii="Aptos Narrow" w:eastAsia="Times New Roman" w:hAnsi="Aptos Narrow" w:cs="Times New Roman"/>
+                <w:color w:val="000000"/>
+                <w:kern w:val="0"/>
+                <w:sz w:val="22"/>
+                <w:szCs w:val="22"/>
+                <w14:ligatures w14:val="none"/>
+              </w:rPr>
+              <w:t>farm_id (Farms)</w:t>
+            </w:r>
+          </w:p>
+        </w:tc>
+        <w:tc>
+          <w:tcPr>
+            <w:tcW w:w="5962" w:type="dxa"/>
+            <w:hideMark/>
+          </w:tcPr>
+          <w:p>
+            <w:pPr>
+              <w:rPr>
+                <w:rFonts w:ascii="Aptos Narrow" w:eastAsia="Times New Roman" w:hAnsi="Aptos Narrow" w:cs="Times New Roman"/>
+                <w:color w:val="000000"/>
+                <w:kern w:val="0"/>
+                <w:sz w:val="22"/>
+                <w:szCs w:val="22"/>
+                <w14:ligatures w14:val="none"/>
+              </w:rPr>
+            </w:pPr>
+            <w:r>
+              <w:rPr>
+                <w:rFonts w:ascii="Aptos Narrow" w:eastAsia="Times New Roman" w:hAnsi="Aptos Narrow" w:cs="Times New Roman"/>
+                <w:color w:val="000000"/>
+                <w:kern w:val="0"/>
+                <w:sz w:val="22"/>
+                <w:szCs w:val="22"/>
+                <w14:ligatures w14:val="none"/>
+              </w:rPr>
+              <w:t>first_name, last_name, job_title (equipment operator/livestock handler/field hand/mechanic/manager), hire_date, hourly_wage, employment_type (full time/part time/seasonal), phone, email</w:t>
+            </w:r>
+          </w:p>
+        </w:tc>
+      </w:tr>
+      <w:tr>
+        <w:trPr>
+          <w:trHeight w:val="288"/>
+        </w:trPr>
+        <w:tc>
+          <w:tcPr>
+            <w:tcW w:w="865" w:type="dxa"/>
+            <w:hideMark/>
+          </w:tcPr>
+          <w:p>
+            <w:pPr>
+              <w:rPr>
+                <w:rFonts w:ascii="Aptos Narrow" w:eastAsia="Times New Roman" w:hAnsi="Aptos Narrow" w:cs="Times New Roman"/>
+                <w:color w:val="000000"/>
+                <w:kern w:val="0"/>
+                <w:sz w:val="22"/>
+                <w:szCs w:val="22"/>
+                <w14:ligatures w14:val="none"/>
+              </w:rPr>
+            </w:pPr>
+            <w:r>
+              <w:rPr>
+                <w:rFonts w:ascii="Aptos Narrow" w:eastAsia="Times New Roman" w:hAnsi="Aptos Narrow" w:cs="Times New Roman"/>
+                <w:color w:val="000000"/>
+                <w:kern w:val="0"/>
+                <w:sz w:val="22"/>
+                <w:szCs w:val="22"/>
+                <w14:ligatures w14:val="none"/>
+              </w:rPr>
+              <w:t>Customers</w:t>
+            </w:r>
+          </w:p>
+        </w:tc>
+        <w:tc>
+          <w:tcPr>
+            <w:tcW w:w="1009" w:type="dxa"/>
+            <w:hideMark/>
+          </w:tcPr>
+          <w:p>
+            <w:pPr>
+              <w:rPr>
+                <w:rFonts w:ascii="Aptos Narrow" w:eastAsia="Times New Roman" w:hAnsi="Aptos Narrow" w:cs="Times New Roman"/>
+                <w:color w:val="000000"/>
+                <w:kern w:val="0"/>
+                <w:sz w:val="22"/>
+                <w:szCs w:val="22"/>
+                <w14:ligatures w14:val="none"/>
+              </w:rPr>
+            </w:pPr>
+            <w:r>
+              <w:rPr>
+                <w:rFonts w:ascii="Aptos Narrow" w:eastAsia="Times New Roman" w:hAnsi="Aptos Narrow" w:cs="Times New Roman"/>
+                <w:color w:val="000000"/>
+                <w:kern w:val="0"/>
+                <w:sz w:val="22"/>
+                <w:szCs w:val="22"/>
+                <w14:ligatures w14:val="none"/>
+              </w:rPr>
+              <w:t>customer_id</w:t>
+            </w:r>
+          </w:p>
+        </w:tc>
+        <w:tc>
+          <w:tcPr>
+            <w:tcW w:w="1627" w:type="dxa"/>
+            <w:hideMark/>
+          </w:tcPr>
+          <w:p>
+            <w:pPr>
+              <w:rPr>
+                <w:rFonts w:ascii="Aptos Narrow" w:eastAsia="Times New Roman" w:hAnsi="Aptos Narrow" w:cs="Times New Roman"/>
+                <w:color w:val="000000"/>
+                <w:kern w:val="0"/>
+                <w:sz w:val="22"/>
+                <w:szCs w:val="22"/>
+                <w14:ligatures w14:val="none"/>
+              </w:rPr>
+            </w:pPr>
+          </w:p>
+        </w:tc>
+        <w:tc>
+          <w:tcPr>
+            <w:tcW w:w="5962" w:type="dxa"/>
+            <w:hideMark/>
+          </w:tcPr>
+          <w:p>
+            <w:pPr>
+              <w:rPr>
+                <w:rFonts w:ascii="Aptos Narrow" w:eastAsia="Times New Roman" w:hAnsi="Aptos Narrow" w:cs="Times New Roman"/>
+                <w:color w:val="000000"/>
+                <w:kern w:val="0"/>
+                <w:sz w:val="22"/>
+                <w:szCs w:val="22"/>
+                <w14:ligatures w14:val="none"/>
+              </w:rPr>
+            </w:pPr>
+            <w:r>
+              <w:rPr>
+                <w:rFonts w:ascii="Aptos Narrow" w:eastAsia="Times New Roman" w:hAnsi="Aptos Narrow" w:cs="Times New Roman"/>
+                <w:color w:val="000000"/>
+                <w:kern w:val="0"/>
+                <w:sz w:val="22"/>
+                <w:szCs w:val="22"/>
+                <w14:ligatures w14:val="none"/>
+              </w:rPr>
+              <w:t>customer_name, customer_type (individual/restaurant/grocer/distributor), street_address (nullable), city (nullable), state (nullable), zip_code (nullable), phone (nullable), email (nullable), CHECK (phone IS NOT NULL OR email IS NOT NULL)</w:t>
+            </w:r>
+          </w:p>
+        </w:tc>
+      </w:tr>
+      <w:tr>
+        <w:trPr>
+          <w:trHeight w:val="288"/>
+        </w:trPr>
+        <w:tc>
+          <w:tcPr>
+            <w:tcW w:w="865" w:type="dxa"/>
+            <w:hideMark/>
+          </w:tcPr>
+          <w:p>
+            <w:pPr>
+              <w:rPr>
+                <w:rFonts w:ascii="Aptos Narrow" w:eastAsia="Times New Roman" w:hAnsi="Aptos Narrow" w:cs="Times New Roman"/>
+                <w:color w:val="000000"/>
+                <w:kern w:val="0"/>
+                <w:sz w:val="22"/>
+                <w:szCs w:val="22"/>
+                <w14:ligatures w14:val="none"/>
+              </w:rPr>
+            </w:pPr>
+            <w:r>
+              <w:rPr>
+                <w:rFonts w:ascii="Aptos Narrow" w:eastAsia="Times New Roman" w:hAnsi="Aptos Narrow" w:cs="Times New Roman"/>
+                <w:color w:val="000000"/>
+                <w:kern w:val="0"/>
+                <w:sz w:val="22"/>
+                <w:szCs w:val="22"/>
+                <w14:ligatures w14:val="none"/>
+              </w:rPr>
+              <w:t>Buildings</w:t>
+            </w:r>
+          </w:p>
+        </w:tc>
+        <w:tc>
+          <w:tcPr>
+            <w:tcW w:w="1009" w:type="dxa"/>
+            <w:hideMark/>
+          </w:tcPr>
+          <w:p>
+            <w:pPr>
+              <w:rPr>
+                <w:rFonts w:ascii="Aptos Narrow" w:eastAsia="Times New Roman" w:hAnsi="Aptos Narrow" w:cs="Times New Roman"/>
+                <w:color w:val="000000"/>
+                <w:kern w:val="0"/>
+                <w:sz w:val="22"/>
+                <w:szCs w:val="22"/>
+                <w14:ligatures w14:val="none"/>
+              </w:rPr>
+            </w:pPr>
+            <w:r>
+              <w:rPr>
+                <w:rFonts w:ascii="Aptos Narrow" w:eastAsia="Times New Roman" w:hAnsi="Aptos Narrow" w:cs="Times New Roman"/>
+                <w:color w:val="000000"/>
+                <w:kern w:val="0"/>
+                <w:sz w:val="22"/>
+                <w:szCs w:val="22"/>
+                <w14:ligatures w14:val="none"/>
+              </w:rPr>
+              <w:t>building_id</w:t>
+            </w:r>
+          </w:p>
+        </w:tc>
+        <w:tc>
+          <w:tcPr>
+            <w:tcW w:w="1627" w:type="dxa"/>
+            <w:hideMark/>
+          </w:tcPr>
+          <w:p>
+            <w:pPr>
+              <w:rPr>
+                <w:rFonts w:ascii="Aptos Narrow" w:eastAsia="Times New Roman" w:hAnsi="Aptos Narrow" w:cs="Times New Roman"/>
+                <w:color w:val="000000"/>
+                <w:kern w:val="0"/>
+                <w:sz w:val="22"/>
+                <w:szCs w:val="22"/>
+                <w14:ligatures w14:val="none"/>
+              </w:rPr>
+            </w:pPr>
+            <w:r>
+              <w:rPr>
+                <w:rFonts w:ascii="Aptos Narrow" w:eastAsia="Times New Roman" w:hAnsi="Aptos Narrow" w:cs="Times New Roman"/>
+                <w:color w:val="000000"/>
+                <w:kern w:val="0"/>
+                <w:sz w:val="22"/>
+                <w:szCs w:val="22"/>
+                <w14:ligatures w14:val="none"/>
+              </w:rPr>
+              <w:t>farm_id (Farms)</w:t>
+            </w:r>
+          </w:p>
+        </w:tc>
+        <w:tc>
+          <w:tcPr>
+            <w:tcW w:w="5962" w:type="dxa"/>
+            <w:hideMark/>
+          </w:tcPr>
+          <w:p>
+            <w:pPr>
+              <w:rPr>
+                <w:rFonts w:ascii="Aptos Narrow" w:eastAsia="Times New Roman" w:hAnsi="Aptos Narrow" w:cs="Times New Roman"/>
+                <w:color w:val="000000"/>
+                <w:kern w:val="0"/>
+                <w:sz w:val="22"/>
+                <w:szCs w:val="22"/>
+                <w14:ligatures w14:val="none"/>
+              </w:rPr>
+            </w:pPr>
+            <w:r>
+              <w:rPr>
+                <w:rFonts w:ascii="Aptos Narrow" w:eastAsia="Times New Roman" w:hAnsi="Aptos Narrow" w:cs="Times New Roman"/>
+                <w:color w:val="000000"/>
+                <w:kern w:val="0"/>
+                <w:sz w:val="22"/>
+                <w:szCs w:val="22"/>
+                <w14:ligatures w14:val="none"/>
+              </w:rPr>
+              <w:t>building_name (nullable), building_type (barn/silo/greenhouse/storage shed/coop), square_feet, capacity, capacity_unit (animals/tons/bushels/machines), year_built, condition_status</w:t>
+            </w:r>
+          </w:p>
+        </w:tc>
+      </w:tr>
+      <w:tr>
+        <w:trPr>
+          <w:trHeight w:val="288"/>
+        </w:trPr>
+        <w:tc>
+          <w:tcPr>
+            <w:tcW w:w="865" w:type="dxa"/>
+            <w:hideMark/>
+          </w:tcPr>
+          <w:p>
+            <w:pPr>
+              <w:rPr>
+                <w:rFonts w:ascii="Aptos Narrow" w:eastAsia="Times New Roman" w:hAnsi="Aptos Narrow" w:cs="Times New Roman"/>
+                <w:color w:val="000000"/>
+                <w:kern w:val="0"/>
+                <w:sz w:val="22"/>
+                <w:szCs w:val="22"/>
+                <w14:ligatures w14:val="none"/>
+              </w:rPr>
+            </w:pPr>
+            <w:r>
+              <w:rPr>
+                <w:rFonts w:ascii="Aptos Narrow" w:eastAsia="Times New Roman" w:hAnsi="Aptos Narrow" w:cs="Times New Roman"/>
+                <w:color w:val="000000"/>
+                <w:kern w:val="0"/>
+                <w:sz w:val="22"/>
+                <w:szCs w:val="22"/>
+                <w14:ligatures w14:val="none"/>
+              </w:rPr>
+              <w:t>Orders</w:t>
+            </w:r>
+          </w:p>
+        </w:tc>
+        <w:tc>
+          <w:tcPr>
+            <w:tcW w:w="1009" w:type="dxa"/>
+            <w:hideMark/>
+          </w:tcPr>
+          <w:p>
+            <w:pPr>
+              <w:rPr>
+                <w:rFonts w:ascii="Aptos Narrow" w:eastAsia="Times New Roman" w:hAnsi="Aptos Narrow" w:cs="Times New Roman"/>
+                <w:color w:val="000000"/>
+                <w:kern w:val="0"/>
+                <w:sz w:val="22"/>
+                <w:szCs w:val="22"/>
+                <w14:ligatures w14:val="none"/>
+              </w:rPr>
+            </w:pPr>
+            <w:r>
+              <w:rPr>
+                <w:rFonts w:ascii="Aptos Narrow" w:eastAsia="Times New Roman" w:hAnsi="Aptos Narrow" w:cs="Times New Roman"/>
+                <w:color w:val="000000"/>
+                <w:kern w:val="0"/>
+                <w:sz w:val="22"/>
+                <w:szCs w:val="22"/>
+                <w14:ligatures w14:val="none"/>
+              </w:rPr>
+              <w:t>order_id</w:t>
+            </w:r>
+          </w:p>
+        </w:tc>
+        <w:tc>
+          <w:tcPr>
+            <w:tcW w:w="1627" w:type="dxa"/>
+            <w:hideMark/>
+          </w:tcPr>
+          <w:p>
+            <w:pPr>
+              <w:rPr>
+                <w:rFonts w:ascii="Aptos Narrow" w:eastAsia="Times New Roman" w:hAnsi="Aptos Narrow" w:cs="Times New Roman"/>
+                <w:color w:val="000000"/>
+                <w:kern w:val="0"/>
+                <w:sz w:val="22"/>
+                <w:szCs w:val="22"/>
+                <w14:ligatures w14:val="none"/>
+              </w:rPr>
+            </w:pPr>
+            <w:r>
+              <w:rPr>
+                <w:rFonts w:ascii="Aptos Narrow" w:eastAsia="Times New Roman" w:hAnsi="Aptos Narrow" w:cs="Times New Roman"/>
+                <w:color w:val="000000"/>
+                <w:kern w:val="0"/>
+                <w:sz w:val="22"/>
+                <w:szCs w:val="22"/>
+                <w14:ligatures w14:val="none"/>
+              </w:rPr>
+              <w:t>customer_id (Customers), farm_id (Farms)</w:t>
+            </w:r>
+          </w:p>
+        </w:tc>
+        <w:tc>
+          <w:tcPr>
+            <w:tcW w:w="5962" w:type="dxa"/>
+            <w:hideMark/>
+          </w:tcPr>
+          <w:p>
+            <w:pPr>
+              <w:rPr>
+                <w:rFonts w:ascii="Aptos Narrow" w:eastAsia="Times New Roman" w:hAnsi="Aptos Narrow" w:cs="Times New Roman"/>
+                <w:color w:val="000000"/>
+                <w:kern w:val="0"/>
+                <w:sz w:val="22"/>
+                <w:szCs w:val="22"/>
+                <w14:ligatures w14:val="none"/>
+              </w:rPr>
+            </w:pPr>
+            <w:r>
+              <w:rPr>
+                <w:rFonts w:ascii="Aptos Narrow" w:eastAsia="Times New Roman" w:hAnsi="Aptos Narrow" w:cs="Times New Roman"/>
+                <w:color w:val="000000"/>
+                <w:kern w:val="0"/>
+                <w:sz w:val="22"/>
+                <w:szCs w:val="22"/>
+                <w14:ligatures w14:val="none"/>
+              </w:rPr>
+              <w:t>order_date, delivery_date (nullable), order_status (pending/shipped/delivered/cancelled), payment_status (paid/unpaid)</w:t>
+            </w:r>
+          </w:p>
+        </w:tc>
+      </w:tr>
+      <w:tr>
+        <w:trPr>
+          <w:trHeight w:val="288"/>
+        </w:trPr>
+        <w:tc>
+          <w:tcPr>
+            <w:tcW w:w="865" w:type="dxa"/>
+            <w:hideMark/>
+          </w:tcPr>
+          <w:p>
+            <w:pPr>
+              <w:rPr>
+                <w:rFonts w:ascii="Aptos Narrow" w:eastAsia="Times New Roman" w:hAnsi="Aptos Narrow" w:cs="Times New Roman"/>
+                <w:color w:val="000000"/>
+                <w:kern w:val="0"/>
+                <w:sz w:val="22"/>
+                <w:szCs w:val="22"/>
+                <w14:ligatures w14:val="none"/>
+              </w:rPr>
+            </w:pPr>
+            <w:r>
+              <w:rPr>
+                <w:rFonts w:ascii="Aptos Narrow" w:eastAsia="Times New Roman" w:hAnsi="Aptos Narrow" w:cs="Times New Roman"/>
+                <w:color w:val="000000"/>
+                <w:kern w:val="0"/>
+                <w:sz w:val="22"/>
+                <w:szCs w:val="22"/>
+                <w14:ligatures w14:val="none"/>
+              </w:rPr>
+              <w:t>Products</w:t>
+            </w:r>
+          </w:p>
+        </w:tc>
+        <w:tc>
+          <w:tcPr>
+            <w:tcW w:w="1009" w:type="dxa"/>
+            <w:hideMark/>
+          </w:tcPr>
+          <w:p>
+            <w:pPr>
+              <w:rPr>
+                <w:rFonts w:ascii="Aptos Narrow" w:eastAsia="Times New Roman" w:hAnsi="Aptos Narrow" w:cs="Times New Roman"/>
+                <w:color w:val="000000"/>
+                <w:kern w:val="0"/>
+                <w:sz w:val="22"/>
+                <w:szCs w:val="22"/>
+                <w14:ligatures w14:val="none"/>
+              </w:rPr>
+            </w:pPr>
+            <w:r>
+              <w:rPr>
+                <w:rFonts w:ascii="Aptos Narrow" w:eastAsia="Times New Roman" w:hAnsi="Aptos Narrow" w:cs="Times New Roman"/>
+                <w:color w:val="000000"/>
+                <w:kern w:val="0"/>
+                <w:sz w:val="22"/>
+                <w:szCs w:val="22"/>
+                <w14:ligatures w14:val="none"/>
+              </w:rPr>
+              <w:t>product_id</w:t>
+            </w:r>
+          </w:p>
+        </w:tc>
+        <w:tc>
+          <w:tcPr>
+            <w:tcW w:w="1627" w:type="dxa"/>
+            <w:hideMark/>
+          </w:tcPr>
+          <w:p>
+            <w:pPr>
+              <w:rPr>
+                <w:rFonts w:ascii="Aptos Narrow" w:eastAsia="Times New Roman" w:hAnsi="Aptos Narrow" w:cs="Times New Roman"/>
+                <w:color w:val="000000"/>
+                <w:kern w:val="0"/>
+                <w:sz w:val="22"/>
+                <w:szCs w:val="22"/>
+                <w14:ligatures w14:val="none"/>
+              </w:rPr>
+            </w:pPr>
+          </w:p>
+        </w:tc>
+        <w:tc>
+          <w:tcPr>
+            <w:tcW w:w="5962" w:type="dxa"/>
+            <w:hideMark/>
+          </w:tcPr>
+          <w:p>
+            <w:pPr>
+              <w:rPr>
+                <w:rFonts w:ascii="Aptos Narrow" w:eastAsia="Times New Roman" w:hAnsi="Aptos Narrow" w:cs="Times New Roman"/>
+                <w:color w:val="000000"/>
+                <w:kern w:val="0"/>
+                <w:sz w:val="22"/>
+                <w:szCs w:val="22"/>
+                <w14:ligatures w14:val="none"/>
+              </w:rPr>
+            </w:pPr>
+            <w:r>
+              <w:rPr>
+                <w:rFonts w:ascii="Aptos Narrow" w:eastAsia="Times New Roman" w:hAnsi="Aptos Narrow" w:cs="Times New Roman"/>
+                <w:color w:val="000000"/>
+                <w:kern w:val="0"/>
+                <w:sz w:val="22"/>
+                <w:szCs w:val="22"/>
+                <w14:ligatures w14:val="none"/>
+              </w:rPr>
+              <w:t>product_name, product_category (produce/grain/dairy/meat/eggs/livestock), unit_of_measure, list_price</w:t>
+            </w:r>
+          </w:p>
+        </w:tc>
+      </w:tr>
+      <w:tr>
+        <w:trPr>
+          <w:trHeight w:val="288"/>
+        </w:trPr>
+        <w:tc>
+          <w:tcPr>
+            <w:tcW w:w="865" w:type="dxa"/>
+            <w:hideMark/>
+          </w:tcPr>
+          <w:p>
+            <w:pPr>
+              <w:rPr>
+                <w:rFonts w:ascii="Aptos Narrow" w:eastAsia="Times New Roman" w:hAnsi="Aptos Narrow" w:cs="Times New Roman"/>
+                <w:color w:val="000000"/>
+                <w:kern w:val="0"/>
+                <w:sz w:val="22"/>
+                <w:szCs w:val="22"/>
+                <w14:ligatures w14:val="none"/>
+              </w:rPr>
+            </w:pPr>
+            <w:r>
+              <w:rPr>
+                <w:rFonts w:ascii="Aptos Narrow" w:eastAsia="Times New Roman" w:hAnsi="Aptos Narrow" w:cs="Times New Roman"/>
+                <w:color w:val="000000"/>
+                <w:kern w:val="0"/>
+                <w:sz w:val="22"/>
+                <w:szCs w:val="22"/>
+                <w14:ligatures w14:val="none"/>
+              </w:rPr>
+              <w:t>Bills</w:t>
+            </w:r>
+          </w:p>
+        </w:tc>
+        <w:tc>
+          <w:tcPr>
+            <w:tcW w:w="1009" w:type="dxa"/>
+            <w:hideMark/>
+          </w:tcPr>
+          <w:p>
+            <w:pPr>
+              <w:rPr>
+                <w:rFonts w:ascii="Aptos Narrow" w:eastAsia="Times New Roman" w:hAnsi="Aptos Narrow" w:cs="Times New Roman"/>
+                <w:color w:val="000000"/>
+                <w:kern w:val="0"/>
+                <w:sz w:val="22"/>
+                <w:szCs w:val="22"/>
+                <w14:ligatures w14:val="none"/>
+              </w:rPr>
+            </w:pPr>
+            <w:r>
+              <w:rPr>
+                <w:rFonts w:ascii="Aptos Narrow" w:eastAsia="Times New Roman" w:hAnsi="Aptos Narrow" w:cs="Times New Roman"/>
+                <w:color w:val="000000"/>
+                <w:kern w:val="0"/>
+                <w:sz w:val="22"/>
+                <w:szCs w:val="22"/>
+                <w14:ligatures w14:val="none"/>
+              </w:rPr>
+              <w:t>bill_id</w:t>
+            </w:r>
+          </w:p>
+        </w:tc>
+        <w:tc>
+          <w:tcPr>
+            <w:tcW w:w="1627" w:type="dxa"/>
+            <w:hideMark/>
+          </w:tcPr>
+          <w:p>
+            <w:pPr>
+              <w:rPr>
+                <w:rFonts w:ascii="Aptos Narrow" w:eastAsia="Times New Roman" w:hAnsi="Aptos Narrow" w:cs="Times New Roman"/>
+                <w:color w:val="000000"/>
+                <w:kern w:val="0"/>
+                <w:sz w:val="22"/>
+                <w:szCs w:val="22"/>
+                <w14:ligatures w14:val="none"/>
+              </w:rPr>
+            </w:pPr>
+            <w:r>
+              <w:rPr>
+                <w:rFonts w:ascii="Aptos Narrow" w:eastAsia="Times New Roman" w:hAnsi="Aptos Narrow" w:cs="Times New Roman"/>
+                <w:color w:val="000000"/>
+                <w:kern w:val="0"/>
+                <w:sz w:val="22"/>
+                <w:szCs w:val="22"/>
+                <w14:ligatures w14:val="none"/>
+              </w:rPr>
+              <w:t>farm_id (Farms), vendor_id (Vendors)</w:t>
+            </w:r>
+          </w:p>
+        </w:tc>
+        <w:tc>
+          <w:tcPr>
+            <w:tcW w:w="5962" w:type="dxa"/>
+            <w:hideMark/>
+          </w:tcPr>
+          <w:p>
+            <w:pPr>
+              <w:rPr>
+                <w:rFonts w:ascii="Aptos Narrow" w:eastAsia="Times New Roman" w:hAnsi="Aptos Narrow" w:cs="Times New Roman"/>
+                <w:color w:val="000000"/>
+                <w:kern w:val="0"/>
+                <w:sz w:val="22"/>
+                <w:szCs w:val="22"/>
+                <w14:ligatures w14:val="none"/>
+              </w:rPr>
+            </w:pPr>
+            <w:r>
+              <w:rPr>
+                <w:rFonts w:ascii="Aptos Narrow" w:eastAsia="Times New Roman" w:hAnsi="Aptos Narrow" w:cs="Times New Roman"/>
+                <w:color w:val="000000"/>
+                <w:kern w:val="0"/>
+                <w:sz w:val="22"/>
+                <w:szCs w:val="22"/>
+                <w14:ligatures w14:val="none"/>
+              </w:rPr>
+              <w:t>bill_category (feed/seed/utilities/repairs/supplies), issue_date, due_date, amount_due</w:t>
+            </w:r>
+          </w:p>
+        </w:tc>
+      </w:tr>
+      <w:tr>
+        <w:trPr>
+          <w:trHeight w:val="288"/>
+        </w:trPr>
+        <w:tc>
+          <w:tcPr>
+            <w:tcW w:w="865" w:type="dxa"/>
+            <w:hideMark/>
+          </w:tcPr>
+          <w:p>
+            <w:pPr>
+              <w:rPr>
+                <w:rFonts w:ascii="Aptos Narrow" w:eastAsia="Times New Roman" w:hAnsi="Aptos Narrow" w:cs="Times New Roman"/>
+                <w:color w:val="000000"/>
+                <w:kern w:val="0"/>
+                <w:sz w:val="22"/>
+                <w:szCs w:val="22"/>
+                <w14:ligatures w14:val="none"/>
+              </w:rPr>
+            </w:pPr>
+            <w:r>
+              <w:rPr>
+                <w:rFonts w:ascii="Aptos Narrow" w:eastAsia="Times New Roman" w:hAnsi="Aptos Narrow" w:cs="Times New Roman"/>
+                <w:color w:val="000000"/>
+                <w:kern w:val="0"/>
+                <w:sz w:val="22"/>
+                <w:szCs w:val="22"/>
+                <w14:ligatures w14:val="none"/>
+              </w:rPr>
+              <w:t>Vendors</w:t>
+            </w:r>
+          </w:p>
+        </w:tc>
+        <w:tc>
+          <w:tcPr>
+            <w:tcW w:w="1009" w:type="dxa"/>
+            <w:hideMark/>
+          </w:tcPr>
+          <w:p>
+            <w:pPr>
+              <w:rPr>
+                <w:rFonts w:ascii="Aptos Narrow" w:eastAsia="Times New Roman" w:hAnsi="Aptos Narrow" w:cs="Times New Roman"/>
+                <w:color w:val="000000"/>
+                <w:kern w:val="0"/>
+                <w:sz w:val="22"/>
+                <w:szCs w:val="22"/>
+                <w14:ligatures w14:val="none"/>
+              </w:rPr>
+            </w:pPr>
+            <w:r>
+              <w:rPr>
+                <w:rFonts w:ascii="Aptos Narrow" w:eastAsia="Times New Roman" w:hAnsi="Aptos Narrow" w:cs="Times New Roman"/>
+                <w:color w:val="000000"/>
+                <w:kern w:val="0"/>
+                <w:sz w:val="22"/>
+                <w:szCs w:val="22"/>
+                <w14:ligatures w14:val="none"/>
+              </w:rPr>
+              <w:t>vendor_id</w:t>
+            </w:r>
+          </w:p>
+        </w:tc>
+        <w:tc>
+          <w:tcPr>
+            <w:tcW w:w="1627" w:type="dxa"/>
+            <w:hideMark/>
+          </w:tcPr>
+          <w:p>
+            <w:pPr>
+              <w:rPr>
+                <w:rFonts w:ascii="Aptos Narrow" w:eastAsia="Times New Roman" w:hAnsi="Aptos Narrow" w:cs="Times New Roman"/>
+                <w:color w:val="000000"/>
+                <w:kern w:val="0"/>
+                <w:sz w:val="22"/>
+                <w:szCs w:val="22"/>
+                <w14:ligatures w14:val="none"/>
+              </w:rPr>
+            </w:pPr>
+          </w:p>
+        </w:tc>
+        <w:tc>
+          <w:tcPr>
+            <w:tcW w:w="5962" w:type="dxa"/>
+            <w:hideMark/>
+          </w:tcPr>
+          <w:p>
+            <w:pPr>
+              <w:rPr>
+                <w:rFonts w:ascii="Aptos Narrow" w:eastAsia="Times New Roman" w:hAnsi="Aptos Narrow" w:cs="Times New Roman"/>
+                <w:color w:val="000000"/>
+                <w:kern w:val="0"/>
+                <w:sz w:val="22"/>
+                <w:szCs w:val="22"/>
+                <w14:ligatures w14:val="none"/>
+              </w:rPr>
+            </w:pPr>
+            <w:r>
+              <w:rPr>
+                <w:rFonts w:ascii="Aptos Narrow" w:eastAsia="Times New Roman" w:hAnsi="Aptos Narrow" w:cs="Times New Roman"/>
+                <w:color w:val="000000"/>
+                <w:kern w:val="0"/>
+                <w:sz w:val="22"/>
+                <w:szCs w:val="22"/>
+                <w14:ligatures w14:val="none"/>
+              </w:rPr>
+              <w:t>vendor_name, street_address, city, state, zip_code, phone, email</w:t>
+            </w:r>
+          </w:p>
+        </w:tc>
+      </w:tr>
+      <w:tr>
+        <w:trPr>
+          <w:trHeight w:val="288"/>
+        </w:trPr>
+        <w:tc>
+          <w:tcPr>
+            <w:tcW w:w="865" w:type="dxa"/>
+            <w:hideMark/>
+          </w:tcPr>
+          <w:p>
+            <w:pPr>
+              <w:rPr>
+                <w:rFonts w:ascii="Aptos Narrow" w:eastAsia="Times New Roman" w:hAnsi="Aptos Narrow" w:cs="Times New Roman"/>
+                <w:color w:val="000000"/>
+                <w:kern w:val="0"/>
+                <w:sz w:val="22"/>
+                <w:szCs w:val="22"/>
+                <w14:ligatures w14:val="none"/>
+              </w:rPr>
+            </w:pPr>
+            <w:r>
+              <w:rPr>
+                <w:rFonts w:ascii="Aptos Narrow" w:eastAsia="Times New Roman" w:hAnsi="Aptos Narrow" w:cs="Times New Roman"/>
+                <w:color w:val="000000"/>
+                <w:kern w:val="0"/>
+                <w:sz w:val="22"/>
+                <w:szCs w:val="22"/>
+                <w14:ligatures w14:val="none"/>
+              </w:rPr>
+              <w:t>Payments</w:t>
+            </w:r>
+          </w:p>
+        </w:tc>
+        <w:tc>
+          <w:tcPr>
+            <w:tcW w:w="1009" w:type="dxa"/>
+            <w:hideMark/>
+          </w:tcPr>
+          <w:p>
+            <w:pPr>
+              <w:rPr>
+                <w:rFonts w:ascii="Aptos Narrow" w:eastAsia="Times New Roman" w:hAnsi="Aptos Narrow" w:cs="Times New Roman"/>
+                <w:color w:val="000000"/>
+                <w:kern w:val="0"/>
+                <w:sz w:val="22"/>
+                <w:szCs w:val="22"/>
+                <w14:ligatures w14:val="none"/>
+              </w:rPr>
+            </w:pPr>
+            <w:r>
+              <w:rPr>
+                <w:rFonts w:ascii="Aptos Narrow" w:eastAsia="Times New Roman" w:hAnsi="Aptos Narrow" w:cs="Times New Roman"/>
+                <w:color w:val="000000"/>
+                <w:kern w:val="0"/>
+                <w:sz w:val="22"/>
+                <w:szCs w:val="22"/>
+                <w14:ligatures w14:val="none"/>
+              </w:rPr>
+              <w:t>payment_id</w:t>
+            </w:r>
+          </w:p>
+        </w:tc>
+        <w:tc>
+          <w:tcPr>
+            <w:tcW w:w="1627" w:type="dxa"/>
+            <w:hideMark/>
+          </w:tcPr>
+          <w:p>
+            <w:pPr>
+              <w:rPr>
+                <w:rFonts w:ascii="Aptos Narrow" w:eastAsia="Times New Roman" w:hAnsi="Aptos Narrow" w:cs="Times New Roman"/>
+                <w:color w:val="000000"/>
+                <w:kern w:val="0"/>
+                <w:sz w:val="22"/>
+                <w:szCs w:val="22"/>
+                <w14:ligatures w14:val="none"/>
+              </w:rPr>
+            </w:pPr>
+            <w:r>
+              <w:rPr>
+                <w:rFonts w:ascii="Aptos Narrow" w:eastAsia="Times New Roman" w:hAnsi="Aptos Narrow" w:cs="Times New Roman"/>
+                <w:color w:val="000000"/>
+                <w:kern w:val="0"/>
+                <w:sz w:val="22"/>
+                <w:szCs w:val="22"/>
+                <w14:ligatures w14:val="none"/>
+              </w:rPr>
+              <w:t>bill_id (Bills)</w:t>
+            </w:r>
+          </w:p>
+        </w:tc>
+        <w:tc>
+          <w:tcPr>
+            <w:tcW w:w="5962" w:type="dxa"/>
+            <w:hideMark/>
+          </w:tcPr>
+          <w:p>
+            <w:pPr>
+              <w:rPr>
+                <w:rFonts w:ascii="Aptos Narrow" w:eastAsia="Times New Roman" w:hAnsi="Aptos Narrow" w:cs="Times New Roman"/>
+                <w:color w:val="000000"/>
+                <w:kern w:val="0"/>
+                <w:sz w:val="22"/>
+                <w:szCs w:val="22"/>
+                <w14:ligatures w14:val="none"/>
+              </w:rPr>
+            </w:pPr>
+            <w:r>
+              <w:rPr>
+                <w:rFonts w:ascii="Aptos Narrow" w:eastAsia="Times New Roman" w:hAnsi="Aptos Narrow" w:cs="Times New Roman"/>
+                <w:color w:val="000000"/>
+                <w:kern w:val="0"/>
+                <w:sz w:val="22"/>
+                <w:szCs w:val="22"/>
+                <w14:ligatures w14:val="none"/>
+              </w:rPr>
+              <w:t>payment_date, payment_amount, payment_method (cash/check/card/transfer)</w:t>
+            </w:r>
+          </w:p>
+        </w:tc>
+      </w:tr>
+    </w:tbl>
     <w:p>
       <w:pPr>
         <w:rPr>
           <w:color w:val="000000" w:themeColor="text1"/>
         </w:rPr>
       </w:pPr>
-      <w:r>
-        <w:rPr>
-          <w:color w:val="000000" w:themeColor="text1"/>
-        </w:rPr>
-        <w:t>Farms</w:t>
-      </w:r>
-    </w:p>
-    <w:p>
-      <w:pPr>
-        <w:pStyle w:val="ListParagraph"/>
-        <w:numPr>
-          <w:ilvl w:val="0"/>
-          <w:numId w:val="2"/>
-        </w:numPr>
-        <w:rPr>
-          <w:color w:val="000000" w:themeColor="text1"/>
-        </w:rPr>
-      </w:pPr>
-      <w:r>
-        <w:rPr>
-          <w:color w:val="000000" w:themeColor="text1"/>
-        </w:rPr>
-        <w:t>farm_id: primary key</w:t>
-      </w:r>
-    </w:p>
-    <w:p>
-      <w:pPr>
-        <w:pStyle w:val="ListParagraph"/>
-        <w:numPr>
-          <w:ilvl w:val="0"/>
-          <w:numId w:val="2"/>
-        </w:numPr>
-        <w:rPr>
-          <w:color w:val="000000" w:themeColor="text1"/>
-        </w:rPr>
-      </w:pPr>
-      <w:r>
-        <w:rPr>
-          <w:color w:val="000000" w:themeColor="text1"/>
-        </w:rPr>
-        <w:t>farm_name</w:t>
-      </w:r>
-    </w:p>
-    <w:p>
-      <w:pPr>
-        <w:pStyle w:val="ListParagraph"/>
-        <w:numPr>
-          <w:ilvl w:val="0"/>
-          <w:numId w:val="2"/>
-        </w:numPr>
-        <w:rPr>
-          <w:color w:val="000000" w:themeColor="text1"/>
-        </w:rPr>
-      </w:pPr>
-      <w:r>
-        <w:rPr>
-          <w:color w:val="000000" w:themeColor="text1"/>
-        </w:rPr>
-        <w:t>street_address</w:t>
-      </w:r>
-    </w:p>
-    <w:p>
-      <w:pPr>
-        <w:pStyle w:val="ListParagraph"/>
-        <w:numPr>
-          <w:ilvl w:val="0"/>
-          <w:numId w:val="2"/>
-        </w:numPr>
-        <w:rPr>
-          <w:color w:val="000000" w:themeColor="text1"/>
-        </w:rPr>
-      </w:pPr>
-      <w:r>
-        <w:rPr>
-          <w:color w:val="000000" w:themeColor="text1"/>
-        </w:rPr>
-        <w:t>city</w:t>
-      </w:r>
-    </w:p>
-    <w:p>
-      <w:pPr>
-        <w:pStyle w:val="ListParagraph"/>
-        <w:numPr>
-          <w:ilvl w:val="0"/>
-          <w:numId w:val="2"/>
-        </w:numPr>
-        <w:rPr>
-          <w:color w:val="000000" w:themeColor="text1"/>
-        </w:rPr>
-      </w:pPr>
-      <w:r>
-        <w:rPr>
-          <w:color w:val="000000" w:themeColor="text1"/>
-        </w:rPr>
-        <w:t>state</w:t>
-      </w:r>
-    </w:p>
-    <w:p>
-      <w:pPr>
-        <w:pStyle w:val="ListParagraph"/>
-        <w:numPr>
-          <w:ilvl w:val="0"/>
-          <w:numId w:val="2"/>
-        </w:numPr>
-        <w:rPr>
-          <w:color w:val="000000" w:themeColor="text1"/>
-        </w:rPr>
-      </w:pPr>
-      <w:r>
-        <w:rPr>
-          <w:color w:val="000000" w:themeColor="text1"/>
-        </w:rPr>
-        <w:t>zip_code</w:t>
-      </w:r>
-    </w:p>
-    <w:p>
-      <w:pPr>
-        <w:pStyle w:val="ListParagraph"/>
-        <w:numPr>
-          <w:ilvl w:val="0"/>
-          <w:numId w:val="2"/>
-        </w:numPr>
-        <w:rPr>
-          <w:color w:val="000000" w:themeColor="text1"/>
-        </w:rPr>
-      </w:pPr>
-      <w:r>
-        <w:rPr>
-          <w:color w:val="000000" w:themeColor="text1"/>
-        </w:rPr>
-        <w:t>total_acres</w:t>
-      </w:r>
-    </w:p>
-    <w:p>
-      <w:pPr>
-        <w:pStyle w:val="ListParagraph"/>
-        <w:numPr>
-          <w:ilvl w:val="0"/>
-          <w:numId w:val="2"/>
-        </w:numPr>
-        <w:rPr>
-          <w:color w:val="000000" w:themeColor="text1"/>
-        </w:rPr>
-      </w:pPr>
-      <w:r>
-        <w:rPr>
-          <w:color w:val="000000" w:themeColor="text1"/>
-        </w:rPr>
-        <w:t>established_date</w:t>
-      </w:r>
-    </w:p>
-    <w:p>
-      <w:pPr>
-        <w:pStyle w:val="ListParagraph"/>
-        <w:numPr>
-          <w:ilvl w:val="0"/>
-          <w:numId w:val="2"/>
-        </w:numPr>
-        <w:rPr>
-          <w:color w:val="000000" w:themeColor="text1"/>
-        </w:rPr>
-      </w:pPr>
-      <w:r>
-        <w:rPr>
-          <w:color w:val="000000" w:themeColor="text1"/>
-        </w:rPr>
-        <w:t>phone</w:t>
-      </w:r>
-    </w:p>
-    <w:p>
-      <w:pPr>
-        <w:rPr>
-          <w:color w:val="000000" w:themeColor="text1"/>
-        </w:rPr>
-      </w:pPr>
-      <w:r>
-        <w:rPr>
-          <w:color w:val="000000" w:themeColor="text1"/>
-        </w:rPr>
-        <w:t xml:space="preserve"> Equipment</w:t>
-      </w:r>
-    </w:p>
-    <w:p>
-      <w:pPr>
-        <w:pStyle w:val="ListParagraph"/>
-        <w:numPr>
-          <w:ilvl w:val="0"/>
-          <w:numId w:val="3"/>
-        </w:numPr>
-        <w:rPr>
-          <w:color w:val="000000" w:themeColor="text1"/>
-        </w:rPr>
-      </w:pPr>
-      <w:r>
-        <w:rPr>
-          <w:color w:val="000000" w:themeColor="text1"/>
-        </w:rPr>
-        <w:t>equipment_id: primary key</w:t>
-      </w:r>
-    </w:p>
-    <w:p>
-      <w:pPr>
-        <w:pStyle w:val="ListParagraph"/>
-        <w:numPr>
-          <w:ilvl w:val="0"/>
-          <w:numId w:val="3"/>
-        </w:numPr>
-        <w:rPr>
-          <w:color w:val="000000" w:themeColor="text1"/>
-        </w:rPr>
-      </w:pPr>
-      <w:r>
-        <w:rPr>
-          <w:color w:val="000000" w:themeColor="text1"/>
-        </w:rPr>
-        <w:lastRenderedPageBreak/>
-        <w:t>equipment_name</w:t>
-      </w:r>
-    </w:p>
-    <w:p>
-      <w:pPr>
-        <w:pStyle w:val="ListParagraph"/>
-        <w:numPr>
-          <w:ilvl w:val="0"/>
-          <w:numId w:val="3"/>
-        </w:numPr>
-        <w:rPr>
-          <w:color w:val="000000" w:themeColor="text1"/>
-        </w:rPr>
-      </w:pPr>
-      <w:r>
-        <w:rPr>
-          <w:color w:val="000000" w:themeColor="text1"/>
-        </w:rPr>
-        <w:t>equipment_type: tractor, harvester, irrigation, trailer</w:t>
-      </w:r>
-    </w:p>
-    <w:p>
-      <w:pPr>
-        <w:pStyle w:val="ListParagraph"/>
-        <w:numPr>
-          <w:ilvl w:val="0"/>
-          <w:numId w:val="3"/>
-        </w:numPr>
-        <w:rPr>
-          <w:color w:val="000000" w:themeColor="text1"/>
-        </w:rPr>
-      </w:pPr>
-      <w:r>
-        <w:rPr>
-          <w:color w:val="000000" w:themeColor="text1"/>
-        </w:rPr>
-        <w:t>manufacturer</w:t>
-      </w:r>
-    </w:p>
-    <w:p>
-      <w:pPr>
-        <w:pStyle w:val="ListParagraph"/>
-        <w:numPr>
-          <w:ilvl w:val="0"/>
-          <w:numId w:val="3"/>
-        </w:numPr>
-        <w:rPr>
-          <w:color w:val="000000" w:themeColor="text1"/>
-        </w:rPr>
-      </w:pPr>
-      <w:r>
-        <w:rPr>
-          <w:color w:val="000000" w:themeColor="text1"/>
-        </w:rPr>
-        <w:t>model</w:t>
-      </w:r>
-    </w:p>
-    <w:p>
-      <w:pPr>
-        <w:pStyle w:val="ListParagraph"/>
-        <w:numPr>
-          <w:ilvl w:val="0"/>
-          <w:numId w:val="3"/>
-        </w:numPr>
-        <w:rPr>
-          <w:color w:val="000000" w:themeColor="text1"/>
-        </w:rPr>
-      </w:pPr>
-      <w:r>
-        <w:rPr>
-          <w:color w:val="000000" w:themeColor="text1"/>
-        </w:rPr>
-        <w:t>serial_number</w:t>
-      </w:r>
-    </w:p>
-    <w:p>
-      <w:pPr>
-        <w:pStyle w:val="ListParagraph"/>
-        <w:numPr>
-          <w:ilvl w:val="0"/>
-          <w:numId w:val="3"/>
-        </w:numPr>
-        <w:rPr>
-          <w:color w:val="000000" w:themeColor="text1"/>
-        </w:rPr>
-      </w:pPr>
-      <w:r>
-        <w:rPr>
-          <w:color w:val="000000" w:themeColor="text1"/>
-        </w:rPr>
-        <w:t>purchase_date</w:t>
-      </w:r>
-    </w:p>
-    <w:p>
-      <w:pPr>
-        <w:pStyle w:val="ListParagraph"/>
-        <w:numPr>
-          <w:ilvl w:val="0"/>
-          <w:numId w:val="3"/>
-        </w:numPr>
-        <w:rPr>
-          <w:color w:val="000000" w:themeColor="text1"/>
-        </w:rPr>
-      </w:pPr>
-      <w:r>
-        <w:rPr>
-          <w:color w:val="000000" w:themeColor="text1"/>
-        </w:rPr>
-        <w:t>purchase_price</w:t>
-      </w:r>
-    </w:p>
-    <w:p>
-      <w:pPr>
-        <w:pStyle w:val="ListParagraph"/>
-        <w:numPr>
-          <w:ilvl w:val="0"/>
-          <w:numId w:val="3"/>
-        </w:numPr>
-        <w:rPr>
-          <w:color w:val="000000" w:themeColor="text1"/>
-        </w:rPr>
-      </w:pPr>
-      <w:r>
-        <w:rPr>
-          <w:color w:val="000000" w:themeColor="text1"/>
-        </w:rPr>
-        <w:t>condition_status: operational, in repair, retired</w:t>
-      </w:r>
-    </w:p>
-    <w:p>
-      <w:pPr>
-        <w:pStyle w:val="ListParagraph"/>
-        <w:numPr>
-          <w:ilvl w:val="0"/>
-          <w:numId w:val="3"/>
-        </w:numPr>
-        <w:rPr>
-          <w:color w:val="000000" w:themeColor="text1"/>
-        </w:rPr>
-      </w:pPr>
-      <w:r>
-        <w:rPr>
-          <w:color w:val="000000" w:themeColor="text1"/>
-        </w:rPr>
-        <w:t>last_service_date: nullable</w:t>
-      </w:r>
-    </w:p>
-    <w:p>
-      <w:pPr>
-        <w:pStyle w:val="ListParagraph"/>
-        <w:numPr>
-          <w:ilvl w:val="0"/>
-          <w:numId w:val="3"/>
-        </w:numPr>
-        <w:rPr>
-          <w:color w:val="000000" w:themeColor="text1"/>
-        </w:rPr>
-      </w:pPr>
-      <w:r>
-        <w:rPr>
-          <w:color w:val="000000" w:themeColor="text1"/>
-        </w:rPr>
-        <w:t>farm_id: foreign key to Farms</w:t>
-      </w:r>
-    </w:p>
-    <w:p>
-      <w:pPr>
-        <w:pStyle w:val="ListParagraph"/>
-        <w:numPr>
-          <w:ilvl w:val="0"/>
-          <w:numId w:val="3"/>
-        </w:numPr>
-        <w:rPr>
-          <w:color w:val="000000" w:themeColor="text1"/>
-        </w:rPr>
-      </w:pPr>
-      <w:r>
-        <w:rPr>
-          <w:color w:val="000000" w:themeColor="text1"/>
-        </w:rPr>
-        <w:t>building_id: foreign key to Buildings, nullable</w:t>
-      </w:r>
-    </w:p>
-    <w:p>
-      <w:pPr>
-        <w:rPr>
-          <w:color w:val="000000" w:themeColor="text1"/>
-        </w:rPr>
-      </w:pPr>
-      <w:r>
-        <w:rPr>
-          <w:color w:val="000000" w:themeColor="text1"/>
-        </w:rPr>
-        <w:t xml:space="preserve"> Animals</w:t>
-      </w:r>
-    </w:p>
-    <w:p>
-      <w:pPr>
-        <w:pStyle w:val="ListParagraph"/>
-        <w:numPr>
-          <w:ilvl w:val="0"/>
-          <w:numId w:val="4"/>
-        </w:numPr>
-        <w:rPr>
-          <w:color w:val="000000" w:themeColor="text1"/>
-        </w:rPr>
-      </w:pPr>
-      <w:r>
-        <w:rPr>
-          <w:color w:val="000000" w:themeColor="text1"/>
-        </w:rPr>
-        <w:t>animal_id: primary key</w:t>
-      </w:r>
-    </w:p>
-    <w:p>
-      <w:pPr>
-        <w:pStyle w:val="ListParagraph"/>
-        <w:numPr>
-          <w:ilvl w:val="0"/>
-          <w:numId w:val="4"/>
-        </w:numPr>
-        <w:rPr>
-          <w:color w:val="000000" w:themeColor="text1"/>
-        </w:rPr>
-      </w:pPr>
-      <w:r>
-        <w:rPr>
-          <w:color w:val="000000" w:themeColor="text1"/>
-        </w:rPr>
-        <w:t>species</w:t>
-      </w:r>
-    </w:p>
-    <w:p>
-      <w:pPr>
-        <w:pStyle w:val="ListParagraph"/>
-        <w:numPr>
-          <w:ilvl w:val="0"/>
-          <w:numId w:val="4"/>
-        </w:numPr>
-        <w:rPr>
-          <w:color w:val="000000" w:themeColor="text1"/>
-        </w:rPr>
-      </w:pPr>
-      <w:r>
-        <w:rPr>
-          <w:color w:val="000000" w:themeColor="text1"/>
-        </w:rPr>
-        <w:t>breed</w:t>
-      </w:r>
-    </w:p>
-    <w:p>
-      <w:pPr>
-        <w:pStyle w:val="ListParagraph"/>
-        <w:numPr>
-          <w:ilvl w:val="0"/>
-          <w:numId w:val="4"/>
-        </w:numPr>
-        <w:rPr>
-          <w:color w:val="000000" w:themeColor="text1"/>
-        </w:rPr>
-      </w:pPr>
-      <w:r>
-        <w:rPr>
-          <w:color w:val="000000" w:themeColor="text1"/>
-        </w:rPr>
-        <w:t>sex</w:t>
-      </w:r>
-    </w:p>
-    <w:p>
-      <w:pPr>
-        <w:pStyle w:val="ListParagraph"/>
-        <w:numPr>
-          <w:ilvl w:val="0"/>
-          <w:numId w:val="4"/>
-        </w:numPr>
-        <w:rPr>
-          <w:color w:val="000000" w:themeColor="text1"/>
-        </w:rPr>
-      </w:pPr>
-      <w:r>
-        <w:rPr>
-          <w:color w:val="000000" w:themeColor="text1"/>
-        </w:rPr>
-        <w:t>birth_date</w:t>
-      </w:r>
-    </w:p>
-    <w:p>
-      <w:pPr>
-        <w:pStyle w:val="ListParagraph"/>
-        <w:numPr>
-          <w:ilvl w:val="0"/>
-          <w:numId w:val="4"/>
-        </w:numPr>
-        <w:rPr>
-          <w:color w:val="000000" w:themeColor="text1"/>
-        </w:rPr>
-      </w:pPr>
-      <w:r>
-        <w:rPr>
-          <w:color w:val="000000" w:themeColor="text1"/>
-        </w:rPr>
-        <w:t>weight_lbs</w:t>
-      </w:r>
-    </w:p>
-    <w:p>
-      <w:pPr>
-        <w:pStyle w:val="ListParagraph"/>
-        <w:numPr>
-          <w:ilvl w:val="0"/>
-          <w:numId w:val="4"/>
-        </w:numPr>
-        <w:rPr>
-          <w:color w:val="000000" w:themeColor="text1"/>
-        </w:rPr>
-      </w:pPr>
-      <w:r>
-        <w:rPr>
-          <w:color w:val="000000" w:themeColor="text1"/>
-        </w:rPr>
-        <w:t>health_status</w:t>
-      </w:r>
-    </w:p>
-    <w:p>
-      <w:pPr>
-        <w:pStyle w:val="ListParagraph"/>
-        <w:numPr>
-          <w:ilvl w:val="0"/>
-          <w:numId w:val="4"/>
-        </w:numPr>
-        <w:rPr>
-          <w:color w:val="000000" w:themeColor="text1"/>
-        </w:rPr>
-      </w:pPr>
-      <w:r>
-        <w:rPr>
-          <w:color w:val="000000" w:themeColor="text1"/>
-        </w:rPr>
-        <w:t>acquisition_date</w:t>
-      </w:r>
-    </w:p>
-    <w:p>
-      <w:pPr>
-        <w:pStyle w:val="ListParagraph"/>
-        <w:numPr>
-          <w:ilvl w:val="0"/>
-          <w:numId w:val="4"/>
-        </w:numPr>
-        <w:rPr>
-          <w:color w:val="000000" w:themeColor="text1"/>
-        </w:rPr>
-      </w:pPr>
-      <w:r>
-        <w:rPr>
-          <w:color w:val="000000" w:themeColor="text1"/>
-        </w:rPr>
-        <w:t>purpose: dairy, meat, breeding, eggs</w:t>
-      </w:r>
-    </w:p>
-    <w:p>
-      <w:pPr>
-        <w:pStyle w:val="ListParagraph"/>
-        <w:numPr>
-          <w:ilvl w:val="0"/>
-          <w:numId w:val="4"/>
-        </w:numPr>
-        <w:rPr>
-          <w:color w:val="000000" w:themeColor="text1"/>
-        </w:rPr>
-      </w:pPr>
-      <w:r>
-        <w:rPr>
-          <w:color w:val="000000" w:themeColor="text1"/>
-        </w:rPr>
-        <w:t>farm_id: foreign key to Farms</w:t>
-      </w:r>
-    </w:p>
-    <w:p>
-      <w:pPr>
-        <w:pStyle w:val="ListParagraph"/>
-        <w:numPr>
-          <w:ilvl w:val="0"/>
-          <w:numId w:val="4"/>
-        </w:numPr>
-        <w:rPr>
-          <w:color w:val="000000" w:themeColor="text1"/>
-        </w:rPr>
-      </w:pPr>
-      <w:r>
-        <w:rPr>
-          <w:color w:val="000000" w:themeColor="text1"/>
-        </w:rPr>
-        <w:t>building_id: foreign key to Buildings, nullable</w:t>
-      </w:r>
-    </w:p>
-    <w:p>
-      <w:pPr>
-        <w:pStyle w:val="ListParagraph"/>
-        <w:numPr>
-          <w:ilvl w:val="0"/>
-          <w:numId w:val="4"/>
-        </w:numPr>
-        <w:rPr>
-          <w:color w:val="000000" w:themeColor="text1"/>
-        </w:rPr>
-      </w:pPr>
-      <w:r>
-        <w:rPr>
-          <w:color w:val="000000" w:themeColor="text1"/>
-        </w:rPr>
-        <w:t>move_in_date: nullable</w:t>
-      </w:r>
-    </w:p>
-    <w:p>
-      <w:pPr>
-        <w:rPr>
-          <w:color w:val="000000" w:themeColor="text1"/>
-        </w:rPr>
-      </w:pPr>
-      <w:r>
-        <w:rPr>
-          <w:color w:val="000000" w:themeColor="text1"/>
-        </w:rPr>
-        <w:t xml:space="preserve"> Crops</w:t>
-      </w:r>
-    </w:p>
-    <w:p>
-      <w:pPr>
-        <w:pStyle w:val="ListParagraph"/>
-        <w:numPr>
-          <w:ilvl w:val="0"/>
-          <w:numId w:val="5"/>
-        </w:numPr>
-        <w:rPr>
-          <w:color w:val="000000" w:themeColor="text1"/>
-        </w:rPr>
-      </w:pPr>
-      <w:r>
-        <w:rPr>
-          <w:color w:val="000000" w:themeColor="text1"/>
-        </w:rPr>
-        <w:t>crop_id: primary key</w:t>
-      </w:r>
-    </w:p>
-    <w:p>
-      <w:pPr>
-        <w:pStyle w:val="ListParagraph"/>
-        <w:numPr>
-          <w:ilvl w:val="0"/>
-          <w:numId w:val="5"/>
-        </w:numPr>
-        <w:rPr>
-          <w:color w:val="000000" w:themeColor="text1"/>
-        </w:rPr>
-      </w:pPr>
-      <w:r>
-        <w:rPr>
-          <w:color w:val="000000" w:themeColor="text1"/>
-        </w:rPr>
-        <w:t>crop_name</w:t>
-      </w:r>
-    </w:p>
-    <w:p>
-      <w:pPr>
-        <w:pStyle w:val="ListParagraph"/>
-        <w:numPr>
-          <w:ilvl w:val="0"/>
-          <w:numId w:val="5"/>
-        </w:numPr>
-        <w:rPr>
-          <w:color w:val="000000" w:themeColor="text1"/>
-        </w:rPr>
-      </w:pPr>
-      <w:r>
-        <w:rPr>
-          <w:color w:val="000000" w:themeColor="text1"/>
-        </w:rPr>
-        <w:t>variety</w:t>
-      </w:r>
-    </w:p>
-    <w:p>
-      <w:pPr>
-        <w:pStyle w:val="ListParagraph"/>
-        <w:numPr>
-          <w:ilvl w:val="0"/>
-          <w:numId w:val="5"/>
-        </w:numPr>
-        <w:rPr>
-          <w:color w:val="000000" w:themeColor="text1"/>
-        </w:rPr>
-      </w:pPr>
-      <w:r>
-        <w:rPr>
-          <w:color w:val="000000" w:themeColor="text1"/>
-        </w:rPr>
-        <w:t>yield_unit: bushels, tons, lbs</w:t>
-      </w:r>
-    </w:p>
-    <w:p>
-      <w:pPr>
-        <w:rPr>
-          <w:color w:val="000000" w:themeColor="text1"/>
-        </w:rPr>
-      </w:pPr>
-      <w:r>
-        <w:rPr>
-          <w:color w:val="000000" w:themeColor="text1"/>
-        </w:rPr>
-        <w:t xml:space="preserve"> Plantings</w:t>
-      </w:r>
-    </w:p>
-    <w:p>
-      <w:pPr>
-        <w:pStyle w:val="ListParagraph"/>
-        <w:numPr>
-          <w:ilvl w:val="0"/>
-          <w:numId w:val="6"/>
-        </w:numPr>
-        <w:rPr>
-          <w:color w:val="000000" w:themeColor="text1"/>
-        </w:rPr>
-      </w:pPr>
-      <w:r>
-        <w:rPr>
-          <w:color w:val="000000" w:themeColor="text1"/>
-        </w:rPr>
-        <w:t>planting_id: primary key</w:t>
-      </w:r>
-    </w:p>
-    <w:p>
-      <w:pPr>
-        <w:pStyle w:val="ListParagraph"/>
-        <w:numPr>
-          <w:ilvl w:val="0"/>
-          <w:numId w:val="6"/>
-        </w:numPr>
-        <w:rPr>
-          <w:color w:val="000000" w:themeColor="text1"/>
-        </w:rPr>
-      </w:pPr>
-      <w:r>
-        <w:rPr>
-          <w:color w:val="000000" w:themeColor="text1"/>
-        </w:rPr>
-        <w:t>field_number</w:t>
-      </w:r>
-    </w:p>
-    <w:p>
-      <w:pPr>
-        <w:pStyle w:val="ListParagraph"/>
-        <w:numPr>
-          <w:ilvl w:val="0"/>
-          <w:numId w:val="6"/>
-        </w:numPr>
-        <w:rPr>
-          <w:color w:val="000000" w:themeColor="text1"/>
-        </w:rPr>
-      </w:pPr>
-      <w:r>
-        <w:rPr>
-          <w:color w:val="000000" w:themeColor="text1"/>
-        </w:rPr>
-        <w:t>acres_planted</w:t>
-      </w:r>
-    </w:p>
-    <w:p>
-      <w:pPr>
-        <w:pStyle w:val="ListParagraph"/>
-        <w:numPr>
-          <w:ilvl w:val="0"/>
-          <w:numId w:val="6"/>
-        </w:numPr>
-        <w:rPr>
-          <w:color w:val="000000" w:themeColor="text1"/>
-        </w:rPr>
-      </w:pPr>
-      <w:r>
-        <w:rPr>
-          <w:color w:val="000000" w:themeColor="text1"/>
-        </w:rPr>
-        <w:t>planting_date</w:t>
-      </w:r>
-    </w:p>
-    <w:p>
-      <w:pPr>
-        <w:pStyle w:val="ListParagraph"/>
-        <w:numPr>
-          <w:ilvl w:val="0"/>
-          <w:numId w:val="6"/>
-        </w:numPr>
-        <w:rPr>
-          <w:color w:val="000000" w:themeColor="text1"/>
-        </w:rPr>
-      </w:pPr>
-      <w:r>
-        <w:rPr>
-          <w:color w:val="000000" w:themeColor="text1"/>
-        </w:rPr>
-        <w:lastRenderedPageBreak/>
-        <w:t>expected_harvest_date</w:t>
-      </w:r>
-    </w:p>
-    <w:p>
-      <w:pPr>
-        <w:pStyle w:val="ListParagraph"/>
-        <w:numPr>
-          <w:ilvl w:val="0"/>
-          <w:numId w:val="6"/>
-        </w:numPr>
-        <w:rPr>
-          <w:color w:val="000000" w:themeColor="text1"/>
-        </w:rPr>
-      </w:pPr>
-      <w:r>
-        <w:rPr>
-          <w:color w:val="000000" w:themeColor="text1"/>
-        </w:rPr>
-        <w:t>actual_harvest_date: nullable</w:t>
-      </w:r>
-    </w:p>
-    <w:p>
-      <w:pPr>
-        <w:pStyle w:val="ListParagraph"/>
-        <w:numPr>
-          <w:ilvl w:val="0"/>
-          <w:numId w:val="6"/>
-        </w:numPr>
-        <w:rPr>
-          <w:color w:val="000000" w:themeColor="text1"/>
-        </w:rPr>
-      </w:pPr>
-      <w:r>
-        <w:rPr>
-          <w:color w:val="000000" w:themeColor="text1"/>
-        </w:rPr>
-        <w:t>yield_amount: nullable</w:t>
-      </w:r>
-    </w:p>
-    <w:p>
-      <w:pPr>
-        <w:pStyle w:val="ListParagraph"/>
-        <w:numPr>
-          <w:ilvl w:val="0"/>
-          <w:numId w:val="6"/>
-        </w:numPr>
-        <w:rPr>
-          <w:color w:val="000000" w:themeColor="text1"/>
-        </w:rPr>
-      </w:pPr>
-      <w:r>
-        <w:rPr>
-          <w:color w:val="000000" w:themeColor="text1"/>
-        </w:rPr>
-        <w:t>growth_status: planted, growing, harvested</w:t>
-      </w:r>
-    </w:p>
-    <w:p>
-      <w:pPr>
-        <w:pStyle w:val="ListParagraph"/>
-        <w:numPr>
-          <w:ilvl w:val="0"/>
-          <w:numId w:val="6"/>
-        </w:numPr>
-        <w:rPr>
-          <w:color w:val="000000" w:themeColor="text1"/>
-        </w:rPr>
-      </w:pPr>
-      <w:r>
-        <w:rPr>
-          <w:color w:val="000000" w:themeColor="text1"/>
-        </w:rPr>
-        <w:t>farm_id: foreign key to Farms</w:t>
-      </w:r>
-    </w:p>
-    <w:p>
-      <w:pPr>
-        <w:pStyle w:val="ListParagraph"/>
-        <w:numPr>
-          <w:ilvl w:val="0"/>
-          <w:numId w:val="6"/>
-        </w:numPr>
-        <w:rPr>
-          <w:color w:val="000000" w:themeColor="text1"/>
-        </w:rPr>
-      </w:pPr>
-      <w:r>
-        <w:rPr>
-          <w:color w:val="000000" w:themeColor="text1"/>
-        </w:rPr>
-        <w:t>crop_id: foreign key to Crops</w:t>
-      </w:r>
-    </w:p>
-    <w:p>
-      <w:pPr>
-        <w:rPr>
-          <w:color w:val="000000" w:themeColor="text1"/>
-        </w:rPr>
-      </w:pPr>
-      <w:r>
-        <w:rPr>
-          <w:color w:val="000000" w:themeColor="text1"/>
-        </w:rPr>
-        <w:t xml:space="preserve"> Workers</w:t>
-      </w:r>
-    </w:p>
-    <w:p>
-      <w:pPr>
-        <w:pStyle w:val="ListParagraph"/>
-        <w:numPr>
-          <w:ilvl w:val="0"/>
-          <w:numId w:val="7"/>
-        </w:numPr>
-        <w:rPr>
-          <w:color w:val="000000" w:themeColor="text1"/>
-        </w:rPr>
-      </w:pPr>
-      <w:r>
-        <w:rPr>
-          <w:color w:val="000000" w:themeColor="text1"/>
-        </w:rPr>
-        <w:t>worker_id: primary key</w:t>
-      </w:r>
-    </w:p>
-    <w:p>
-      <w:pPr>
-        <w:pStyle w:val="ListParagraph"/>
-        <w:numPr>
-          <w:ilvl w:val="0"/>
-          <w:numId w:val="7"/>
-        </w:numPr>
-        <w:rPr>
-          <w:color w:val="000000" w:themeColor="text1"/>
-        </w:rPr>
-      </w:pPr>
-      <w:r>
-        <w:rPr>
-          <w:color w:val="000000" w:themeColor="text1"/>
-        </w:rPr>
-        <w:t>first_name</w:t>
-      </w:r>
-    </w:p>
-    <w:p>
-      <w:pPr>
-        <w:pStyle w:val="ListParagraph"/>
-        <w:numPr>
-          <w:ilvl w:val="0"/>
-          <w:numId w:val="7"/>
-        </w:numPr>
-        <w:rPr>
-          <w:color w:val="000000" w:themeColor="text1"/>
-        </w:rPr>
-      </w:pPr>
-      <w:r>
-        <w:rPr>
-          <w:color w:val="000000" w:themeColor="text1"/>
-        </w:rPr>
-        <w:t>last_name</w:t>
-      </w:r>
-    </w:p>
-    <w:p>
-      <w:pPr>
-        <w:pStyle w:val="ListParagraph"/>
-        <w:numPr>
-          <w:ilvl w:val="0"/>
-          <w:numId w:val="7"/>
-        </w:numPr>
-        <w:rPr>
-          <w:color w:val="000000" w:themeColor="text1"/>
-        </w:rPr>
-      </w:pPr>
-      <w:r>
-        <w:rPr>
-          <w:color w:val="000000" w:themeColor="text1"/>
-        </w:rPr>
-        <w:t>job_title: equipment operator, livestock handler, field hand, mechanic, manager</w:t>
-      </w:r>
-    </w:p>
-    <w:p>
-      <w:pPr>
-        <w:pStyle w:val="ListParagraph"/>
-        <w:numPr>
-          <w:ilvl w:val="0"/>
-          <w:numId w:val="7"/>
-        </w:numPr>
-        <w:rPr>
-          <w:color w:val="000000" w:themeColor="text1"/>
-        </w:rPr>
-      </w:pPr>
-      <w:r>
-        <w:rPr>
-          <w:color w:val="000000" w:themeColor="text1"/>
-        </w:rPr>
-        <w:t>hire_date</w:t>
-      </w:r>
-    </w:p>
-    <w:p>
-      <w:pPr>
-        <w:pStyle w:val="ListParagraph"/>
-        <w:numPr>
-          <w:ilvl w:val="0"/>
-          <w:numId w:val="7"/>
-        </w:numPr>
-        <w:rPr>
-          <w:color w:val="000000" w:themeColor="text1"/>
-        </w:rPr>
-      </w:pPr>
-      <w:r>
-        <w:rPr>
-          <w:color w:val="000000" w:themeColor="text1"/>
-        </w:rPr>
-        <w:t>hourly_wage</w:t>
-      </w:r>
-    </w:p>
-    <w:p>
-      <w:pPr>
-        <w:pStyle w:val="ListParagraph"/>
-        <w:numPr>
-          <w:ilvl w:val="0"/>
-          <w:numId w:val="7"/>
-        </w:numPr>
-        <w:rPr>
-          <w:color w:val="000000" w:themeColor="text1"/>
-        </w:rPr>
-      </w:pPr>
-      <w:r>
-        <w:rPr>
-          <w:color w:val="000000" w:themeColor="text1"/>
-        </w:rPr>
-        <w:t>employment_type: full time, part time, seasonal</w:t>
-      </w:r>
-    </w:p>
-    <w:p>
-      <w:pPr>
-        <w:pStyle w:val="ListParagraph"/>
-        <w:numPr>
-          <w:ilvl w:val="0"/>
-          <w:numId w:val="7"/>
-        </w:numPr>
-        <w:rPr>
-          <w:color w:val="000000" w:themeColor="text1"/>
-        </w:rPr>
-      </w:pPr>
-      <w:r>
-        <w:rPr>
-          <w:color w:val="000000" w:themeColor="text1"/>
-        </w:rPr>
-        <w:t>phone</w:t>
-      </w:r>
-    </w:p>
-    <w:p>
-      <w:pPr>
-        <w:pStyle w:val="ListParagraph"/>
-        <w:numPr>
-          <w:ilvl w:val="0"/>
-          <w:numId w:val="7"/>
-        </w:numPr>
-        <w:rPr>
-          <w:color w:val="000000" w:themeColor="text1"/>
-        </w:rPr>
-      </w:pPr>
-      <w:r>
-        <w:rPr>
-          <w:color w:val="000000" w:themeColor="text1"/>
-        </w:rPr>
-        <w:t>email</w:t>
-      </w:r>
-    </w:p>
-    <w:p>
-      <w:pPr>
-        <w:pStyle w:val="ListParagraph"/>
-        <w:numPr>
-          <w:ilvl w:val="0"/>
-          <w:numId w:val="7"/>
-        </w:numPr>
-        <w:rPr>
-          <w:color w:val="000000" w:themeColor="text1"/>
-        </w:rPr>
-      </w:pPr>
-      <w:r>
-        <w:rPr>
-          <w:color w:val="000000" w:themeColor="text1"/>
-        </w:rPr>
-        <w:t>farm_id: foreign key to Farms</w:t>
-      </w:r>
-    </w:p>
-    <w:p>
-      <w:pPr>
-        <w:rPr>
-          <w:color w:val="000000" w:themeColor="text1"/>
-        </w:rPr>
-      </w:pPr>
-      <w:r>
-        <w:rPr>
-          <w:color w:val="000000" w:themeColor="text1"/>
-        </w:rPr>
-        <w:t xml:space="preserve"> Customers</w:t>
-      </w:r>
-    </w:p>
-    <w:p>
-      <w:pPr>
-        <w:pStyle w:val="ListParagraph"/>
-        <w:numPr>
-          <w:ilvl w:val="0"/>
-          <w:numId w:val="8"/>
-        </w:numPr>
-        <w:rPr>
-          <w:color w:val="000000" w:themeColor="text1"/>
-        </w:rPr>
-      </w:pPr>
-      <w:r>
-        <w:rPr>
-          <w:color w:val="000000" w:themeColor="text1"/>
-        </w:rPr>
-        <w:t>customer_id: primary key</w:t>
-      </w:r>
-    </w:p>
-    <w:p>
-      <w:pPr>
-        <w:pStyle w:val="ListParagraph"/>
-        <w:numPr>
-          <w:ilvl w:val="0"/>
-          <w:numId w:val="8"/>
-        </w:numPr>
-        <w:rPr>
-          <w:color w:val="000000" w:themeColor="text1"/>
-        </w:rPr>
-      </w:pPr>
-      <w:r>
-        <w:rPr>
-          <w:color w:val="000000" w:themeColor="text1"/>
-        </w:rPr>
-        <w:t>customer_name</w:t>
-      </w:r>
-    </w:p>
-    <w:p>
-      <w:pPr>
-        <w:pStyle w:val="ListParagraph"/>
-        <w:numPr>
-          <w:ilvl w:val="0"/>
-          <w:numId w:val="8"/>
-        </w:numPr>
-        <w:rPr>
-          <w:color w:val="000000" w:themeColor="text1"/>
-        </w:rPr>
-      </w:pPr>
-      <w:r>
-        <w:rPr>
-          <w:color w:val="000000" w:themeColor="text1"/>
-        </w:rPr>
-        <w:t>customer_type: individual, restaurant, grocer, distributor</w:t>
-      </w:r>
-    </w:p>
-    <w:p>
-      <w:pPr>
-        <w:pStyle w:val="ListParagraph"/>
-        <w:numPr>
-          <w:ilvl w:val="0"/>
-          <w:numId w:val="8"/>
-        </w:numPr>
-        <w:rPr>
-          <w:color w:val="000000" w:themeColor="text1"/>
-        </w:rPr>
-      </w:pPr>
-      <w:r>
-        <w:rPr>
-          <w:color w:val="000000" w:themeColor="text1"/>
-        </w:rPr>
-        <w:t>street_address: nullable</w:t>
-      </w:r>
-    </w:p>
-    <w:p>
-      <w:pPr>
-        <w:pStyle w:val="ListParagraph"/>
-        <w:numPr>
-          <w:ilvl w:val="0"/>
-          <w:numId w:val="8"/>
-        </w:numPr>
-        <w:rPr>
-          <w:color w:val="000000" w:themeColor="text1"/>
-        </w:rPr>
-      </w:pPr>
-      <w:r>
-        <w:rPr>
-          <w:color w:val="000000" w:themeColor="text1"/>
-        </w:rPr>
-        <w:t>city: nullable</w:t>
-      </w:r>
-    </w:p>
-    <w:p>
-      <w:pPr>
-        <w:pStyle w:val="ListParagraph"/>
-        <w:numPr>
-          <w:ilvl w:val="0"/>
-          <w:numId w:val="8"/>
-        </w:numPr>
-        <w:rPr>
-          <w:color w:val="000000" w:themeColor="text1"/>
-        </w:rPr>
-      </w:pPr>
-      <w:r>
-        <w:rPr>
-          <w:color w:val="000000" w:themeColor="text1"/>
-        </w:rPr>
-        <w:t>state: nullable</w:t>
-      </w:r>
-    </w:p>
-    <w:p>
-      <w:pPr>
-        <w:pStyle w:val="ListParagraph"/>
-        <w:numPr>
-          <w:ilvl w:val="0"/>
-          <w:numId w:val="8"/>
-        </w:numPr>
-        <w:rPr>
-          <w:color w:val="000000" w:themeColor="text1"/>
-        </w:rPr>
-      </w:pPr>
-      <w:r>
-        <w:rPr>
-          <w:color w:val="000000" w:themeColor="text1"/>
-        </w:rPr>
-        <w:t>zip_code: nullable</w:t>
-      </w:r>
-    </w:p>
-    <w:p>
-      <w:pPr>
-        <w:pStyle w:val="ListParagraph"/>
-        <w:numPr>
-          <w:ilvl w:val="0"/>
-          <w:numId w:val="8"/>
-        </w:numPr>
-        <w:rPr>
-          <w:color w:val="000000" w:themeColor="text1"/>
-        </w:rPr>
-      </w:pPr>
-      <w:r>
-        <w:rPr>
-          <w:color w:val="000000" w:themeColor="text1"/>
-        </w:rPr>
-        <w:t>phone: nullable</w:t>
-      </w:r>
-    </w:p>
-    <w:p>
-      <w:pPr>
-        <w:pStyle w:val="ListParagraph"/>
-        <w:numPr>
-          <w:ilvl w:val="0"/>
-          <w:numId w:val="8"/>
-        </w:numPr>
-        <w:rPr>
-          <w:color w:val="000000" w:themeColor="text1"/>
-        </w:rPr>
-      </w:pPr>
-      <w:r>
-        <w:rPr>
-          <w:color w:val="000000" w:themeColor="text1"/>
-        </w:rPr>
-        <w:t>email: nullable</w:t>
-      </w:r>
-    </w:p>
-    <w:p>
-      <w:pPr>
-        <w:pStyle w:val="ListParagraph"/>
-        <w:numPr>
-          <w:ilvl w:val="0"/>
-          <w:numId w:val="8"/>
-        </w:numPr>
-        <w:rPr>
-          <w:color w:val="000000" w:themeColor="text1"/>
-        </w:rPr>
-      </w:pPr>
-      <w:r>
-        <w:rPr>
-          <w:color w:val="000000" w:themeColor="text1"/>
-        </w:rPr>
-        <w:t>constraint: CHECK (phone IS NOT NULL OR email IS NOT NULL)</w:t>
-      </w:r>
-    </w:p>
-    <w:p>
-      <w:pPr>
-        <w:rPr>
-          <w:color w:val="000000" w:themeColor="text1"/>
-        </w:rPr>
-      </w:pPr>
-      <w:r>
-        <w:rPr>
-          <w:color w:val="000000" w:themeColor="text1"/>
-        </w:rPr>
-        <w:t xml:space="preserve"> Buildings</w:t>
-      </w:r>
-    </w:p>
-    <w:p>
-      <w:pPr>
-        <w:pStyle w:val="ListParagraph"/>
-        <w:numPr>
-          <w:ilvl w:val="0"/>
-          <w:numId w:val="9"/>
-        </w:numPr>
-        <w:rPr>
-          <w:color w:val="000000" w:themeColor="text1"/>
-        </w:rPr>
-      </w:pPr>
-      <w:r>
-        <w:rPr>
-          <w:color w:val="000000" w:themeColor="text1"/>
-        </w:rPr>
-        <w:t>building_id: primary key</w:t>
-      </w:r>
-    </w:p>
-    <w:p>
-      <w:pPr>
-        <w:pStyle w:val="ListParagraph"/>
-        <w:numPr>
-          <w:ilvl w:val="0"/>
-          <w:numId w:val="9"/>
-        </w:numPr>
-        <w:rPr>
-          <w:color w:val="000000" w:themeColor="text1"/>
-        </w:rPr>
-      </w:pPr>
-      <w:r>
-        <w:rPr>
-          <w:color w:val="000000" w:themeColor="text1"/>
-        </w:rPr>
-        <w:t>building_name: nullable</w:t>
-      </w:r>
-    </w:p>
-    <w:p>
-      <w:pPr>
-        <w:pStyle w:val="ListParagraph"/>
-        <w:numPr>
-          <w:ilvl w:val="0"/>
-          <w:numId w:val="9"/>
-        </w:numPr>
-        <w:rPr>
-          <w:color w:val="000000" w:themeColor="text1"/>
-        </w:rPr>
-      </w:pPr>
-      <w:r>
-        <w:rPr>
-          <w:color w:val="000000" w:themeColor="text1"/>
-        </w:rPr>
-        <w:t>building_type: barn, silo, greenhouse, storage shed, coop</w:t>
-      </w:r>
-    </w:p>
-    <w:p>
-      <w:pPr>
-        <w:pStyle w:val="ListParagraph"/>
-        <w:numPr>
-          <w:ilvl w:val="0"/>
-          <w:numId w:val="9"/>
-        </w:numPr>
-        <w:rPr>
-          <w:color w:val="000000" w:themeColor="text1"/>
-        </w:rPr>
-      </w:pPr>
-      <w:r>
-        <w:rPr>
-          <w:color w:val="000000" w:themeColor="text1"/>
-        </w:rPr>
-        <w:t>square_feet</w:t>
-      </w:r>
-    </w:p>
-    <w:p>
-      <w:pPr>
-        <w:pStyle w:val="ListParagraph"/>
-        <w:numPr>
-          <w:ilvl w:val="0"/>
-          <w:numId w:val="9"/>
-        </w:numPr>
-        <w:rPr>
-          <w:color w:val="000000" w:themeColor="text1"/>
-        </w:rPr>
-      </w:pPr>
-      <w:r>
-        <w:rPr>
-          <w:color w:val="000000" w:themeColor="text1"/>
-        </w:rPr>
-        <w:t>capacity</w:t>
-      </w:r>
-    </w:p>
-    <w:p>
-      <w:pPr>
-        <w:pStyle w:val="ListParagraph"/>
-        <w:numPr>
-          <w:ilvl w:val="0"/>
-          <w:numId w:val="9"/>
-        </w:numPr>
-        <w:rPr>
-          <w:color w:val="000000" w:themeColor="text1"/>
-        </w:rPr>
-      </w:pPr>
-      <w:r>
-        <w:rPr>
-          <w:color w:val="000000" w:themeColor="text1"/>
-        </w:rPr>
-        <w:lastRenderedPageBreak/>
-        <w:t>capacity_unit: animals, tons, bushels, machines</w:t>
-      </w:r>
-    </w:p>
-    <w:p>
-      <w:pPr>
-        <w:pStyle w:val="ListParagraph"/>
-        <w:numPr>
-          <w:ilvl w:val="0"/>
-          <w:numId w:val="9"/>
-        </w:numPr>
-        <w:rPr>
-          <w:color w:val="000000" w:themeColor="text1"/>
-        </w:rPr>
-      </w:pPr>
-      <w:r>
-        <w:rPr>
-          <w:color w:val="000000" w:themeColor="text1"/>
-        </w:rPr>
-        <w:t>year_built</w:t>
-      </w:r>
-    </w:p>
-    <w:p>
-      <w:pPr>
-        <w:pStyle w:val="ListParagraph"/>
-        <w:numPr>
-          <w:ilvl w:val="0"/>
-          <w:numId w:val="9"/>
-        </w:numPr>
-        <w:rPr>
-          <w:color w:val="000000" w:themeColor="text1"/>
-        </w:rPr>
-      </w:pPr>
-      <w:r>
-        <w:rPr>
-          <w:color w:val="000000" w:themeColor="text1"/>
-        </w:rPr>
-        <w:t>condition_status</w:t>
-      </w:r>
-    </w:p>
-    <w:p>
-      <w:pPr>
-        <w:pStyle w:val="ListParagraph"/>
-        <w:numPr>
-          <w:ilvl w:val="0"/>
-          <w:numId w:val="9"/>
-        </w:numPr>
-        <w:rPr>
-          <w:color w:val="000000" w:themeColor="text1"/>
-        </w:rPr>
-      </w:pPr>
-      <w:r>
-        <w:rPr>
-          <w:color w:val="000000" w:themeColor="text1"/>
-        </w:rPr>
-        <w:t>farm_id: foreign key to Farms</w:t>
-      </w:r>
-    </w:p>
-    <w:p>
-      <w:pPr>
-        <w:rPr>
-          <w:color w:val="000000" w:themeColor="text1"/>
-        </w:rPr>
-      </w:pPr>
-      <w:r>
-        <w:rPr>
-          <w:color w:val="000000" w:themeColor="text1"/>
-        </w:rPr>
-        <w:t xml:space="preserve"> Orders</w:t>
-      </w:r>
-    </w:p>
-    <w:p>
-      <w:pPr>
-        <w:pStyle w:val="ListParagraph"/>
-        <w:numPr>
-          <w:ilvl w:val="0"/>
-          <w:numId w:val="10"/>
-        </w:numPr>
-        <w:rPr>
-          <w:color w:val="000000" w:themeColor="text1"/>
-        </w:rPr>
-      </w:pPr>
-      <w:r>
-        <w:rPr>
-          <w:color w:val="000000" w:themeColor="text1"/>
-        </w:rPr>
-        <w:t>order_id: primary key</w:t>
-      </w:r>
-    </w:p>
-    <w:p>
-      <w:pPr>
-        <w:pStyle w:val="ListParagraph"/>
-        <w:numPr>
-          <w:ilvl w:val="0"/>
-          <w:numId w:val="10"/>
-        </w:numPr>
-        <w:rPr>
-          <w:color w:val="000000" w:themeColor="text1"/>
-        </w:rPr>
-      </w:pPr>
-      <w:r>
-        <w:rPr>
-          <w:color w:val="000000" w:themeColor="text1"/>
-        </w:rPr>
-        <w:t>order_date</w:t>
-      </w:r>
-    </w:p>
-    <w:p>
-      <w:pPr>
-        <w:pStyle w:val="ListParagraph"/>
-        <w:numPr>
-          <w:ilvl w:val="0"/>
-          <w:numId w:val="10"/>
-        </w:numPr>
-        <w:rPr>
-          <w:color w:val="000000" w:themeColor="text1"/>
-        </w:rPr>
-      </w:pPr>
-      <w:r>
-        <w:rPr>
-          <w:color w:val="000000" w:themeColor="text1"/>
-        </w:rPr>
-        <w:t>delivery_date: nullable</w:t>
-      </w:r>
-    </w:p>
-    <w:p>
-      <w:pPr>
-        <w:pStyle w:val="ListParagraph"/>
-        <w:numPr>
-          <w:ilvl w:val="0"/>
-          <w:numId w:val="10"/>
-        </w:numPr>
-        <w:rPr>
-          <w:color w:val="000000" w:themeColor="text1"/>
-        </w:rPr>
-      </w:pPr>
-      <w:r>
-        <w:rPr>
-          <w:color w:val="000000" w:themeColor="text1"/>
-        </w:rPr>
-        <w:t>order_status: pending, shipped, delivered, cancelled</w:t>
-      </w:r>
-    </w:p>
-    <w:p>
-      <w:pPr>
-        <w:pStyle w:val="ListParagraph"/>
-        <w:numPr>
-          <w:ilvl w:val="0"/>
-          <w:numId w:val="10"/>
-        </w:numPr>
-        <w:rPr>
-          <w:color w:val="000000" w:themeColor="text1"/>
-        </w:rPr>
-      </w:pPr>
-      <w:r>
-        <w:rPr>
-          <w:color w:val="000000" w:themeColor="text1"/>
-        </w:rPr>
-        <w:t>payment_status: paid, unpaid</w:t>
-      </w:r>
-    </w:p>
-    <w:p>
-      <w:pPr>
-        <w:pStyle w:val="ListParagraph"/>
-        <w:numPr>
-          <w:ilvl w:val="0"/>
-          <w:numId w:val="10"/>
-        </w:numPr>
-        <w:rPr>
-          <w:color w:val="000000" w:themeColor="text1"/>
-        </w:rPr>
-      </w:pPr>
-      <w:r>
-        <w:rPr>
-          <w:color w:val="000000" w:themeColor="text1"/>
-        </w:rPr>
-        <w:t>customer_id: foreign key to Customers</w:t>
-      </w:r>
-    </w:p>
-    <w:p>
-      <w:pPr>
-        <w:pStyle w:val="ListParagraph"/>
-        <w:numPr>
-          <w:ilvl w:val="0"/>
-          <w:numId w:val="10"/>
-        </w:numPr>
-        <w:rPr>
-          <w:color w:val="000000" w:themeColor="text1"/>
-        </w:rPr>
-      </w:pPr>
-      <w:r>
-        <w:rPr>
-          <w:color w:val="000000" w:themeColor="text1"/>
-        </w:rPr>
-        <w:t>farm_id: foreign key to Farms</w:t>
-      </w:r>
-    </w:p>
-    <w:p>
-      <w:pPr>
-        <w:rPr>
-          <w:color w:val="000000" w:themeColor="text1"/>
-        </w:rPr>
-      </w:pPr>
-      <w:r>
-        <w:rPr>
-          <w:color w:val="000000" w:themeColor="text1"/>
-        </w:rPr>
-        <w:t xml:space="preserve"> Products</w:t>
-      </w:r>
-    </w:p>
-    <w:p>
-      <w:pPr>
-        <w:pStyle w:val="ListParagraph"/>
-        <w:numPr>
-          <w:ilvl w:val="0"/>
-          <w:numId w:val="11"/>
-        </w:numPr>
-        <w:rPr>
-          <w:color w:val="000000" w:themeColor="text1"/>
-        </w:rPr>
-      </w:pPr>
-      <w:r>
-        <w:rPr>
-          <w:color w:val="000000" w:themeColor="text1"/>
-        </w:rPr>
-        <w:t>product_id: primary key</w:t>
-      </w:r>
-    </w:p>
-    <w:p>
-      <w:pPr>
-        <w:pStyle w:val="ListParagraph"/>
-        <w:numPr>
-          <w:ilvl w:val="0"/>
-          <w:numId w:val="11"/>
-        </w:numPr>
-        <w:rPr>
-          <w:color w:val="000000" w:themeColor="text1"/>
-        </w:rPr>
-      </w:pPr>
-      <w:r>
-        <w:rPr>
-          <w:color w:val="000000" w:themeColor="text1"/>
-        </w:rPr>
-        <w:t>product_name</w:t>
-      </w:r>
-    </w:p>
-    <w:p>
-      <w:pPr>
-        <w:pStyle w:val="ListParagraph"/>
-        <w:numPr>
-          <w:ilvl w:val="0"/>
-          <w:numId w:val="11"/>
-        </w:numPr>
-        <w:rPr>
-          <w:color w:val="000000" w:themeColor="text1"/>
-        </w:rPr>
-      </w:pPr>
-      <w:r>
-        <w:rPr>
-          <w:color w:val="000000" w:themeColor="text1"/>
-        </w:rPr>
-        <w:t>product_category: produce, grain, dairy, meat, eggs, livestock</w:t>
-      </w:r>
-    </w:p>
-    <w:p>
-      <w:pPr>
-        <w:pStyle w:val="ListParagraph"/>
-        <w:numPr>
-          <w:ilvl w:val="0"/>
-          <w:numId w:val="11"/>
-        </w:numPr>
-        <w:rPr>
-          <w:color w:val="000000" w:themeColor="text1"/>
-        </w:rPr>
-      </w:pPr>
-      <w:r>
-        <w:rPr>
-          <w:color w:val="000000" w:themeColor="text1"/>
-        </w:rPr>
-        <w:t>unit_of_measure</w:t>
-      </w:r>
-    </w:p>
-    <w:p>
-      <w:pPr>
-        <w:pStyle w:val="ListParagraph"/>
-        <w:numPr>
-          <w:ilvl w:val="0"/>
-          <w:numId w:val="11"/>
-        </w:numPr>
-        <w:rPr>
-          <w:color w:val="000000" w:themeColor="text1"/>
-        </w:rPr>
-      </w:pPr>
-      <w:r>
-        <w:rPr>
-          <w:color w:val="000000" w:themeColor="text1"/>
-        </w:rPr>
-        <w:t>list_price</w:t>
-      </w:r>
-    </w:p>
-    <w:p>
-      <w:pPr>
-        <w:rPr>
-          <w:color w:val="000000" w:themeColor="text1"/>
-        </w:rPr>
-      </w:pPr>
-      <w:r>
-        <w:rPr>
-          <w:color w:val="000000" w:themeColor="text1"/>
-        </w:rPr>
-        <w:t xml:space="preserve"> Bills</w:t>
-      </w:r>
-    </w:p>
-    <w:p>
-      <w:pPr>
-        <w:pStyle w:val="ListParagraph"/>
-        <w:numPr>
-          <w:ilvl w:val="0"/>
-          <w:numId w:val="12"/>
-        </w:numPr>
-        <w:rPr>
-          <w:color w:val="000000" w:themeColor="text1"/>
-        </w:rPr>
-      </w:pPr>
-      <w:r>
-        <w:rPr>
-          <w:color w:val="000000" w:themeColor="text1"/>
-        </w:rPr>
-        <w:t>bill_id: primary key</w:t>
-      </w:r>
-    </w:p>
-    <w:p>
-      <w:pPr>
-        <w:pStyle w:val="ListParagraph"/>
-        <w:numPr>
-          <w:ilvl w:val="0"/>
-          <w:numId w:val="12"/>
-        </w:numPr>
-        <w:rPr>
-          <w:color w:val="000000" w:themeColor="text1"/>
-        </w:rPr>
-      </w:pPr>
-      <w:r>
-        <w:rPr>
-          <w:color w:val="000000" w:themeColor="text1"/>
-        </w:rPr>
-        <w:t>bill_category: feed, seed, utilities, repairs, supplies</w:t>
-      </w:r>
-    </w:p>
-    <w:p>
-      <w:pPr>
-        <w:pStyle w:val="ListParagraph"/>
-        <w:numPr>
-          <w:ilvl w:val="0"/>
-          <w:numId w:val="12"/>
-        </w:numPr>
-        <w:rPr>
-          <w:color w:val="000000" w:themeColor="text1"/>
-        </w:rPr>
-      </w:pPr>
-      <w:r>
-        <w:rPr>
-          <w:color w:val="000000" w:themeColor="text1"/>
-        </w:rPr>
-        <w:t>issue_date</w:t>
-      </w:r>
-    </w:p>
-    <w:p>
-      <w:pPr>
-        <w:pStyle w:val="ListParagraph"/>
-        <w:numPr>
-          <w:ilvl w:val="0"/>
-          <w:numId w:val="12"/>
-        </w:numPr>
-        <w:rPr>
-          <w:color w:val="000000" w:themeColor="text1"/>
-        </w:rPr>
-      </w:pPr>
-      <w:r>
-        <w:rPr>
-          <w:color w:val="000000" w:themeColor="text1"/>
-        </w:rPr>
-        <w:t>due_date</w:t>
-      </w:r>
-    </w:p>
-    <w:p>
-      <w:pPr>
-        <w:pStyle w:val="ListParagraph"/>
-        <w:numPr>
-          <w:ilvl w:val="0"/>
-          <w:numId w:val="12"/>
-        </w:numPr>
-        <w:rPr>
-          <w:color w:val="000000" w:themeColor="text1"/>
-        </w:rPr>
-      </w:pPr>
-      <w:r>
-        <w:rPr>
-          <w:color w:val="000000" w:themeColor="text1"/>
-        </w:rPr>
-        <w:t>amount_due</w:t>
-      </w:r>
-    </w:p>
-    <w:p>
-      <w:pPr>
-        <w:pStyle w:val="ListParagraph"/>
-        <w:numPr>
-          <w:ilvl w:val="0"/>
-          <w:numId w:val="12"/>
-        </w:numPr>
-        <w:rPr>
-          <w:color w:val="000000" w:themeColor="text1"/>
-        </w:rPr>
-      </w:pPr>
-      <w:r>
-        <w:rPr>
-          <w:color w:val="000000" w:themeColor="text1"/>
-        </w:rPr>
-        <w:t>farm_id: foreign key to Farms</w:t>
-      </w:r>
-    </w:p>
-    <w:p>
-      <w:pPr>
-        <w:pStyle w:val="ListParagraph"/>
-        <w:numPr>
-          <w:ilvl w:val="0"/>
-          <w:numId w:val="12"/>
-        </w:numPr>
-        <w:rPr>
-          <w:color w:val="000000" w:themeColor="text1"/>
-        </w:rPr>
-      </w:pPr>
-      <w:r>
-        <w:rPr>
-          <w:color w:val="000000" w:themeColor="text1"/>
-        </w:rPr>
-        <w:t>vendor_id: foreign key to Vendors</w:t>
-      </w:r>
-    </w:p>
-    <w:p>
-      <w:pPr>
-        <w:rPr>
-          <w:color w:val="000000" w:themeColor="text1"/>
-        </w:rPr>
-      </w:pPr>
-      <w:r>
-        <w:rPr>
-          <w:color w:val="000000" w:themeColor="text1"/>
-        </w:rPr>
-        <w:t xml:space="preserve"> Vendors</w:t>
-      </w:r>
-    </w:p>
-    <w:p>
-      <w:pPr>
-        <w:pStyle w:val="ListParagraph"/>
-        <w:numPr>
-          <w:ilvl w:val="0"/>
-          <w:numId w:val="13"/>
-        </w:numPr>
-        <w:rPr>
-          <w:color w:val="000000" w:themeColor="text1"/>
-        </w:rPr>
-      </w:pPr>
-      <w:r>
-        <w:rPr>
-          <w:color w:val="000000" w:themeColor="text1"/>
-        </w:rPr>
-        <w:t>vendor_id: primary key</w:t>
-      </w:r>
-    </w:p>
-    <w:p>
-      <w:pPr>
-        <w:pStyle w:val="ListParagraph"/>
-        <w:numPr>
-          <w:ilvl w:val="0"/>
-          <w:numId w:val="13"/>
-        </w:numPr>
-        <w:rPr>
-          <w:color w:val="000000" w:themeColor="text1"/>
-        </w:rPr>
-      </w:pPr>
-      <w:r>
-        <w:rPr>
-          <w:color w:val="000000" w:themeColor="text1"/>
-        </w:rPr>
-        <w:t>vendor_name</w:t>
-      </w:r>
-    </w:p>
-    <w:p>
-      <w:pPr>
-        <w:pStyle w:val="ListParagraph"/>
-        <w:numPr>
-          <w:ilvl w:val="0"/>
-          <w:numId w:val="13"/>
-        </w:numPr>
-        <w:rPr>
-          <w:color w:val="000000" w:themeColor="text1"/>
-        </w:rPr>
-      </w:pPr>
-      <w:r>
-        <w:rPr>
-          <w:color w:val="000000" w:themeColor="text1"/>
-        </w:rPr>
-        <w:t>street_address</w:t>
-      </w:r>
-    </w:p>
-    <w:p>
-      <w:pPr>
-        <w:pStyle w:val="ListParagraph"/>
-        <w:numPr>
-          <w:ilvl w:val="0"/>
-          <w:numId w:val="13"/>
-        </w:numPr>
-        <w:rPr>
-          <w:color w:val="000000" w:themeColor="text1"/>
-        </w:rPr>
-      </w:pPr>
-      <w:r>
-        <w:rPr>
-          <w:color w:val="000000" w:themeColor="text1"/>
-        </w:rPr>
-        <w:t>city</w:t>
-      </w:r>
-    </w:p>
-    <w:p>
-      <w:pPr>
-        <w:pStyle w:val="ListParagraph"/>
-        <w:numPr>
-          <w:ilvl w:val="0"/>
-          <w:numId w:val="13"/>
-        </w:numPr>
-        <w:rPr>
-          <w:color w:val="000000" w:themeColor="text1"/>
-        </w:rPr>
-      </w:pPr>
-      <w:r>
-        <w:rPr>
-          <w:color w:val="000000" w:themeColor="text1"/>
-        </w:rPr>
-        <w:t>state</w:t>
-      </w:r>
-    </w:p>
-    <w:p>
-      <w:pPr>
-        <w:pStyle w:val="ListParagraph"/>
-        <w:numPr>
-          <w:ilvl w:val="0"/>
-          <w:numId w:val="13"/>
-        </w:numPr>
-        <w:rPr>
-          <w:color w:val="000000" w:themeColor="text1"/>
-        </w:rPr>
-      </w:pPr>
-      <w:r>
-        <w:rPr>
-          <w:color w:val="000000" w:themeColor="text1"/>
-        </w:rPr>
-        <w:t>zip_code</w:t>
-      </w:r>
-    </w:p>
-    <w:p>
-      <w:pPr>
-        <w:pStyle w:val="ListParagraph"/>
-        <w:numPr>
-          <w:ilvl w:val="0"/>
-          <w:numId w:val="13"/>
-        </w:numPr>
-        <w:rPr>
-          <w:color w:val="000000" w:themeColor="text1"/>
-        </w:rPr>
-      </w:pPr>
-      <w:r>
-        <w:rPr>
-          <w:color w:val="000000" w:themeColor="text1"/>
-        </w:rPr>
-        <w:lastRenderedPageBreak/>
-        <w:t>phone</w:t>
-      </w:r>
-    </w:p>
-    <w:p>
-      <w:pPr>
-        <w:pStyle w:val="ListParagraph"/>
-        <w:numPr>
-          <w:ilvl w:val="0"/>
-          <w:numId w:val="13"/>
-        </w:numPr>
-        <w:rPr>
-          <w:color w:val="000000" w:themeColor="text1"/>
-        </w:rPr>
-      </w:pPr>
-      <w:r>
-        <w:rPr>
-          <w:color w:val="000000" w:themeColor="text1"/>
-        </w:rPr>
-        <w:t>email</w:t>
-      </w:r>
-    </w:p>
-    <w:p>
-      <w:pPr>
-        <w:rPr>
-          <w:color w:val="000000" w:themeColor="text1"/>
-        </w:rPr>
-      </w:pPr>
-      <w:r>
-        <w:rPr>
-          <w:color w:val="000000" w:themeColor="text1"/>
-        </w:rPr>
-        <w:t xml:space="preserve"> Payments</w:t>
-      </w:r>
-    </w:p>
-    <w:p>
-      <w:pPr>
-        <w:pStyle w:val="ListParagraph"/>
-        <w:numPr>
-          <w:ilvl w:val="0"/>
-          <w:numId w:val="14"/>
-        </w:numPr>
-        <w:rPr>
-          <w:color w:val="000000" w:themeColor="text1"/>
-        </w:rPr>
-      </w:pPr>
-      <w:r>
-        <w:rPr>
-          <w:color w:val="000000" w:themeColor="text1"/>
-        </w:rPr>
-        <w:t>payment_id: primary key</w:t>
-      </w:r>
-    </w:p>
-    <w:p>
-      <w:pPr>
-        <w:pStyle w:val="ListParagraph"/>
-        <w:numPr>
-          <w:ilvl w:val="0"/>
-          <w:numId w:val="14"/>
-        </w:numPr>
-        <w:rPr>
-          <w:color w:val="000000" w:themeColor="text1"/>
-        </w:rPr>
-      </w:pPr>
-      <w:r>
-        <w:rPr>
-          <w:color w:val="000000" w:themeColor="text1"/>
-        </w:rPr>
-        <w:t>payment_date</w:t>
-      </w:r>
-    </w:p>
-    <w:p>
-      <w:pPr>
-        <w:pStyle w:val="ListParagraph"/>
-        <w:numPr>
-          <w:ilvl w:val="0"/>
-          <w:numId w:val="14"/>
-        </w:numPr>
-        <w:rPr>
-          <w:color w:val="000000" w:themeColor="text1"/>
-        </w:rPr>
-      </w:pPr>
-      <w:r>
-        <w:rPr>
-          <w:color w:val="000000" w:themeColor="text1"/>
-        </w:rPr>
-        <w:t>payment_amount</w:t>
-      </w:r>
-    </w:p>
-    <w:p>
-      <w:pPr>
-        <w:pStyle w:val="ListParagraph"/>
-        <w:numPr>
-          <w:ilvl w:val="0"/>
-          <w:numId w:val="14"/>
-        </w:numPr>
-        <w:rPr>
-          <w:color w:val="000000" w:themeColor="text1"/>
-        </w:rPr>
-      </w:pPr>
-      <w:r>
-        <w:rPr>
-          <w:color w:val="000000" w:themeColor="text1"/>
-        </w:rPr>
-        <w:t>payment_method: cash, check, card, transfer</w:t>
-      </w:r>
-    </w:p>
-    <w:p>
-      <w:pPr>
-        <w:pStyle w:val="ListParagraph"/>
-        <w:numPr>
-          <w:ilvl w:val="0"/>
-          <w:numId w:val="14"/>
-        </w:numPr>
-        <w:rPr>
-          <w:color w:val="000000" w:themeColor="text1"/>
-        </w:rPr>
-      </w:pPr>
-      <w:r>
-        <w:rPr>
-          <w:color w:val="000000" w:themeColor="text1"/>
-        </w:rPr>
-        <w:t>bill_id: foreign key to Bills</w:t>
-      </w:r>
     </w:p>
     <w:p>
       <w:pPr>
@@ -3596,6 +3164,7 @@
                 <w:szCs w:val="22"/>
                 <w14:ligatures w14:val="none"/>
               </w:rPr>
+              <w:lastRenderedPageBreak/>
               <w:t>Fulfills</w:t>
             </w:r>
           </w:p>
@@ -4469,7 +4038,6 @@
         <w:rPr>
           <w:color w:val="000000" w:themeColor="text1"/>
         </w:rPr>
-        <w:lastRenderedPageBreak/>
         <w:t xml:space="preserve"> Stocks</w:t>
       </w:r>
     </w:p>
@@ -4668,6 +4236,7 @@
         <w:rPr>
           <w:color w:val="000000" w:themeColor="text1"/>
         </w:rPr>
+        <w:lastRenderedPageBreak/>
         <w:t>The owner can see which products are in stock to bring to the farmer’s market.</w:t>
       </w:r>
     </w:p>
@@ -4703,23 +4272,7 @@
           <w:iCs/>
           <w:color w:val="000000" w:themeColor="text1"/>
         </w:rPr>
-        <w:t>Farm_mgmt_db_er_diagra</w:t>
-      </w:r>
-      <w:r>
-        <w:rPr>
-          <w:i/>
-          <w:iCs/>
-          <w:color w:val="000000" w:themeColor="text1"/>
-        </w:rPr>
-        <w:t>m</w:t>
-      </w:r>
-      <w:r>
-        <w:rPr>
-          <w:i/>
-          <w:iCs/>
-          <w:color w:val="000000" w:themeColor="text1"/>
-        </w:rPr>
-        <w:t>.drawio.svg</w:t>
+        <w:t>Farm_mgmt_db_er_diagram.drawio.svg</w:t>
       </w:r>
       <w:r>
         <w:rPr>
@@ -7732,6 +7285,25 @@
       <w:color w:val="404040" w:themeColor="text1" w:themeTint="BF"/>
     </w:rPr>
   </w:style>
+  <w:style w:type="table" w:styleId="TableGrid">
+    <w:name w:val="Table Grid"/>
+    <w:basedOn w:val="TableNormal"/>
+    <w:uiPriority w:val="39"/>
+    <w:rsid w:val="00AC29B8"/>
+    <w:pPr>
+      <w:spacing w:after="0" w:line="240" w:lineRule="auto"/>
+    </w:pPr>
+    <w:tblPr>
+      <w:tblBorders>
+        <w:top w:val="single" w:sz="4" w:space="0" w:color="auto"/>
+        <w:left w:val="single" w:sz="4" w:space="0" w:color="auto"/>
+        <w:bottom w:val="single" w:sz="4" w:space="0" w:color="auto"/>
+        <w:right w:val="single" w:sz="4" w:space="0" w:color="auto"/>
+        <w:insideH w:val="single" w:sz="4" w:space="0" w:color="auto"/>
+        <w:insideV w:val="single" w:sz="4" w:space="0" w:color="auto"/>
+      </w:tblBorders>
+    </w:tblPr>
+  </w:style>
 </w:styles>
 </file>
 

</xml_diff>